<commit_message>
feat: plot with cutoff
</commit_message>
<xml_diff>
--- a/docs/index.docx
+++ b/docs/index.docx
@@ -851,6 +851,32 @@
               <w:jc w:val="left"/>
             </w:pPr>
             <w:r>
+              <w:t xml:space="preserve">Excluídos por missings (&gt; 5 em Q1-Q26)</w:t>
+            </w:r>
+          </w:p>
+        </w:tc>
+        <w:tc>
+          <w:tcPr/>
+          <w:p>
+            <w:pPr>
+              <w:pStyle w:val="Compact"/>
+              <w:jc w:val="right"/>
+            </w:pPr>
+            <w:r>
+              <w:t xml:space="preserve">3</w:t>
+            </w:r>
+          </w:p>
+        </w:tc>
+      </w:tr>
+      <w:tr>
+        <w:tc>
+          <w:tcPr/>
+          <w:p>
+            <w:pPr>
+              <w:pStyle w:val="Compact"/>
+              <w:jc w:val="left"/>
+            </w:pPr>
+            <w:r>
               <w:t xml:space="preserve">Elegíveis para Nível 2</w:t>
             </w:r>
           </w:p>
@@ -863,7 +889,33 @@
               <w:jc w:val="right"/>
             </w:pPr>
             <w:r>
-              <w:t xml:space="preserve">1298</w:t>
+              <w:t xml:space="preserve">1295</w:t>
+            </w:r>
+          </w:p>
+        </w:tc>
+      </w:tr>
+      <w:tr>
+        <w:tc>
+          <w:tcPr/>
+          <w:p>
+            <w:pPr>
+              <w:pStyle w:val="Compact"/>
+              <w:jc w:val="left"/>
+            </w:pPr>
+            <w:r>
+              <w:t xml:space="preserve">NAs restantes na escala Q1-Q26</w:t>
+            </w:r>
+          </w:p>
+        </w:tc>
+        <w:tc>
+          <w:tcPr/>
+          <w:p>
+            <w:pPr>
+              <w:pStyle w:val="Compact"/>
+              <w:jc w:val="right"/>
+            </w:pPr>
+            <w:r>
+              <w:t xml:space="preserve">90</w:t>
             </w:r>
           </w:p>
         </w:tc>
@@ -897,7 +949,7 @@
       </w:hyperlink>
     </w:p>
     <w:bookmarkEnd w:id="25"/>
-    <w:bookmarkStart w:id="55" w:name="cálculo-dos-indicadores-cier-nível-2"/>
+    <w:bookmarkStart w:id="76" w:name="cálculo-dos-indicadores-cier-nível-2"/>
     <w:p>
       <w:pPr>
         <w:pStyle w:val="Heading2"/>
@@ -1865,13 +1917,355 @@
       </w:hyperlink>
     </w:p>
     <w:bookmarkEnd w:id="51"/>
-    <w:bookmarkStart w:id="54" w:name="flags-de-cier"/>
+    <w:bookmarkStart w:id="72" w:name="gráficos-com-pontos-de-corte"/>
     <w:p>
       <w:pPr>
         <w:pStyle w:val="Heading3"/>
       </w:pPr>
       <w:r>
-        <w:t xml:space="preserve">4.4 Flags de C/IER</w:t>
+        <w:t xml:space="preserve">4.4 Gráficos com pontos de corte</w:t>
+      </w:r>
+    </w:p>
+    <w:p>
+      <w:pPr>
+        <w:pStyle w:val="Heading4"/>
+      </w:pPr>
+      <w:r>
+        <w:t xml:space="preserve">Laz.R</w:t>
+      </w:r>
+    </w:p>
+    <w:p>
+      <w:pPr>
+        <w:pStyle w:val="FirstParagraph"/>
+      </w:pPr>
+      <w:bookmarkStart w:id="55" w:name="cum-lazr"/>
+      <w:r>
+        <w:drawing>
+          <wp:inline>
+            <wp:extent cx="5334000" cy="3810000"/>
+            <wp:effectExtent b="0" l="0" r="0" t="0"/>
+            <wp:docPr descr="" title="" id="53" name="Picture"/>
+            <a:graphic>
+              <a:graphicData uri="http://schemas.openxmlformats.org/drawingml/2006/picture">
+                <pic:pic>
+                  <pic:nvPicPr>
+                    <pic:cNvPr descr="index_files/figure-docx/Scripts-ProcessingScripts-02_posthoc-cum-lazr-output-1.png" id="54" name="Picture"/>
+                    <pic:cNvPicPr>
+                      <a:picLocks noChangeArrowheads="1" noChangeAspect="1"/>
+                    </pic:cNvPicPr>
+                  </pic:nvPicPr>
+                  <pic:blipFill>
+                    <a:blip r:embed="rId52"/>
+                    <a:stretch>
+                      <a:fillRect/>
+                    </a:stretch>
+                  </pic:blipFill>
+                  <pic:spPr bwMode="auto">
+                    <a:xfrm>
+                      <a:off x="0" y="0"/>
+                      <a:ext cx="5334000" cy="3810000"/>
+                    </a:xfrm>
+                    <a:prstGeom prst="rect">
+                      <a:avLst/>
+                    </a:prstGeom>
+                    <a:noFill/>
+                    <a:ln w="9525">
+                      <a:noFill/>
+                      <a:headEnd/>
+                      <a:tailEnd/>
+                    </a:ln>
+                  </pic:spPr>
+                </pic:pic>
+              </a:graphicData>
+            </a:graphic>
+          </wp:inline>
+        </w:drawing>
+      </w:r>
+      <w:bookmarkEnd w:id="55"/>
+    </w:p>
+    <w:p>
+      <w:pPr>
+        <w:pStyle w:val="BodyText"/>
+      </w:pPr>
+      <w:r>
+        <w:rPr>
+          <w:vertAlign w:val="subscript"/>
+        </w:rPr>
+        <w:t xml:space="preserve">Source:</w:t>
+      </w:r>
+      <w:r>
+        <w:rPr>
+          <w:vertAlign w:val="subscript"/>
+        </w:rPr>
+        <w:t xml:space="preserve"> </w:t>
+      </w:r>
+      <w:hyperlink r:id="rId56">
+        <w:r>
+          <w:rPr>
+            <w:rStyle w:val="Hyperlink"/>
+            <w:vertAlign w:val="subscript"/>
+          </w:rPr>
+          <w:t xml:space="preserve">Nível 2 — Indicadores post hoc C/IER</w:t>
+        </w:r>
+      </w:hyperlink>
+    </w:p>
+    <w:p>
+      <w:pPr>
+        <w:pStyle w:val="Heading4"/>
+      </w:pPr>
+      <w:r>
+        <w:t xml:space="preserve">Longstring</w:t>
+      </w:r>
+    </w:p>
+    <w:p>
+      <w:pPr>
+        <w:pStyle w:val="FirstParagraph"/>
+      </w:pPr>
+      <w:bookmarkStart w:id="60" w:name="cum-longstr"/>
+      <w:r>
+        <w:drawing>
+          <wp:inline>
+            <wp:extent cx="5334000" cy="3810000"/>
+            <wp:effectExtent b="0" l="0" r="0" t="0"/>
+            <wp:docPr descr="" title="" id="58" name="Picture"/>
+            <a:graphic>
+              <a:graphicData uri="http://schemas.openxmlformats.org/drawingml/2006/picture">
+                <pic:pic>
+                  <pic:nvPicPr>
+                    <pic:cNvPr descr="index_files/figure-docx/Scripts-ProcessingScripts-02_posthoc-cum-longstr-output-1.png" id="59" name="Picture"/>
+                    <pic:cNvPicPr>
+                      <a:picLocks noChangeArrowheads="1" noChangeAspect="1"/>
+                    </pic:cNvPicPr>
+                  </pic:nvPicPr>
+                  <pic:blipFill>
+                    <a:blip r:embed="rId57"/>
+                    <a:stretch>
+                      <a:fillRect/>
+                    </a:stretch>
+                  </pic:blipFill>
+                  <pic:spPr bwMode="auto">
+                    <a:xfrm>
+                      <a:off x="0" y="0"/>
+                      <a:ext cx="5334000" cy="3810000"/>
+                    </a:xfrm>
+                    <a:prstGeom prst="rect">
+                      <a:avLst/>
+                    </a:prstGeom>
+                    <a:noFill/>
+                    <a:ln w="9525">
+                      <a:noFill/>
+                      <a:headEnd/>
+                      <a:tailEnd/>
+                    </a:ln>
+                  </pic:spPr>
+                </pic:pic>
+              </a:graphicData>
+            </a:graphic>
+          </wp:inline>
+        </w:drawing>
+      </w:r>
+      <w:bookmarkEnd w:id="60"/>
+    </w:p>
+    <w:p>
+      <w:pPr>
+        <w:pStyle w:val="BodyText"/>
+      </w:pPr>
+      <w:r>
+        <w:rPr>
+          <w:vertAlign w:val="subscript"/>
+        </w:rPr>
+        <w:t xml:space="preserve">Source:</w:t>
+      </w:r>
+      <w:r>
+        <w:rPr>
+          <w:vertAlign w:val="subscript"/>
+        </w:rPr>
+        <w:t xml:space="preserve"> </w:t>
+      </w:r>
+      <w:hyperlink r:id="rId61">
+        <w:r>
+          <w:rPr>
+            <w:rStyle w:val="Hyperlink"/>
+            <w:vertAlign w:val="subscript"/>
+          </w:rPr>
+          <w:t xml:space="preserve">Nível 2 — Indicadores post hoc C/IER</w:t>
+        </w:r>
+      </w:hyperlink>
+    </w:p>
+    <w:p>
+      <w:pPr>
+        <w:pStyle w:val="Heading4"/>
+      </w:pPr>
+      <w:r>
+        <w:t xml:space="preserve">Mahalanobis Distance</w:t>
+      </w:r>
+    </w:p>
+    <w:p>
+      <w:pPr>
+        <w:pStyle w:val="FirstParagraph"/>
+      </w:pPr>
+      <w:bookmarkStart w:id="65" w:name="cum-md"/>
+      <w:r>
+        <w:drawing>
+          <wp:inline>
+            <wp:extent cx="5334000" cy="3810000"/>
+            <wp:effectExtent b="0" l="0" r="0" t="0"/>
+            <wp:docPr descr="" title="" id="63" name="Picture"/>
+            <a:graphic>
+              <a:graphicData uri="http://schemas.openxmlformats.org/drawingml/2006/picture">
+                <pic:pic>
+                  <pic:nvPicPr>
+                    <pic:cNvPr descr="index_files/figure-docx/Scripts-ProcessingScripts-02_posthoc-cum-md-output-1.png" id="64" name="Picture"/>
+                    <pic:cNvPicPr>
+                      <a:picLocks noChangeArrowheads="1" noChangeAspect="1"/>
+                    </pic:cNvPicPr>
+                  </pic:nvPicPr>
+                  <pic:blipFill>
+                    <a:blip r:embed="rId62"/>
+                    <a:stretch>
+                      <a:fillRect/>
+                    </a:stretch>
+                  </pic:blipFill>
+                  <pic:spPr bwMode="auto">
+                    <a:xfrm>
+                      <a:off x="0" y="0"/>
+                      <a:ext cx="5334000" cy="3810000"/>
+                    </a:xfrm>
+                    <a:prstGeom prst="rect">
+                      <a:avLst/>
+                    </a:prstGeom>
+                    <a:noFill/>
+                    <a:ln w="9525">
+                      <a:noFill/>
+                      <a:headEnd/>
+                      <a:tailEnd/>
+                    </a:ln>
+                  </pic:spPr>
+                </pic:pic>
+              </a:graphicData>
+            </a:graphic>
+          </wp:inline>
+        </w:drawing>
+      </w:r>
+      <w:bookmarkEnd w:id="65"/>
+    </w:p>
+    <w:p>
+      <w:pPr>
+        <w:pStyle w:val="BodyText"/>
+      </w:pPr>
+      <w:r>
+        <w:rPr>
+          <w:vertAlign w:val="subscript"/>
+        </w:rPr>
+        <w:t xml:space="preserve">Source:</w:t>
+      </w:r>
+      <w:r>
+        <w:rPr>
+          <w:vertAlign w:val="subscript"/>
+        </w:rPr>
+        <w:t xml:space="preserve"> </w:t>
+      </w:r>
+      <w:hyperlink r:id="rId66">
+        <w:r>
+          <w:rPr>
+            <w:rStyle w:val="Hyperlink"/>
+            <w:vertAlign w:val="subscript"/>
+          </w:rPr>
+          <w:t xml:space="preserve">Nível 2 — Indicadores post hoc C/IER</w:t>
+        </w:r>
+      </w:hyperlink>
+    </w:p>
+    <w:p>
+      <w:pPr>
+        <w:pStyle w:val="Heading4"/>
+      </w:pPr>
+      <w:r>
+        <w:t xml:space="preserve">IRV</w:t>
+      </w:r>
+    </w:p>
+    <w:p>
+      <w:pPr>
+        <w:pStyle w:val="FirstParagraph"/>
+      </w:pPr>
+      <w:bookmarkStart w:id="70" w:name="cum-irv"/>
+      <w:r>
+        <w:drawing>
+          <wp:inline>
+            <wp:extent cx="5334000" cy="3810000"/>
+            <wp:effectExtent b="0" l="0" r="0" t="0"/>
+            <wp:docPr descr="" title="" id="68" name="Picture"/>
+            <a:graphic>
+              <a:graphicData uri="http://schemas.openxmlformats.org/drawingml/2006/picture">
+                <pic:pic>
+                  <pic:nvPicPr>
+                    <pic:cNvPr descr="index_files/figure-docx/Scripts-ProcessingScripts-02_posthoc-cum-irv-output-1.png" id="69" name="Picture"/>
+                    <pic:cNvPicPr>
+                      <a:picLocks noChangeArrowheads="1" noChangeAspect="1"/>
+                    </pic:cNvPicPr>
+                  </pic:nvPicPr>
+                  <pic:blipFill>
+                    <a:blip r:embed="rId67"/>
+                    <a:stretch>
+                      <a:fillRect/>
+                    </a:stretch>
+                  </pic:blipFill>
+                  <pic:spPr bwMode="auto">
+                    <a:xfrm>
+                      <a:off x="0" y="0"/>
+                      <a:ext cx="5334000" cy="3810000"/>
+                    </a:xfrm>
+                    <a:prstGeom prst="rect">
+                      <a:avLst/>
+                    </a:prstGeom>
+                    <a:noFill/>
+                    <a:ln w="9525">
+                      <a:noFill/>
+                      <a:headEnd/>
+                      <a:tailEnd/>
+                    </a:ln>
+                  </pic:spPr>
+                </pic:pic>
+              </a:graphicData>
+            </a:graphic>
+          </wp:inline>
+        </w:drawing>
+      </w:r>
+      <w:bookmarkEnd w:id="70"/>
+    </w:p>
+    <w:p>
+      <w:pPr>
+        <w:pStyle w:val="BodyText"/>
+      </w:pPr>
+      <w:r>
+        <w:rPr>
+          <w:vertAlign w:val="subscript"/>
+        </w:rPr>
+        <w:t xml:space="preserve">Source:</w:t>
+      </w:r>
+      <w:r>
+        <w:rPr>
+          <w:vertAlign w:val="subscript"/>
+        </w:rPr>
+        <w:t xml:space="preserve"> </w:t>
+      </w:r>
+      <w:hyperlink r:id="rId71">
+        <w:r>
+          <w:rPr>
+            <w:rStyle w:val="Hyperlink"/>
+            <w:vertAlign w:val="subscript"/>
+          </w:rPr>
+          <w:t xml:space="preserve">Nível 2 — Indicadores post hoc C/IER</w:t>
+        </w:r>
+      </w:hyperlink>
+    </w:p>
+    <w:bookmarkEnd w:id="72"/>
+    <w:bookmarkStart w:id="75" w:name="flags-de-cier"/>
+    <w:p>
+      <w:pPr>
+        <w:pStyle w:val="Heading3"/>
+      </w:pPr>
+      <w:r>
+        <w:t xml:space="preserve">4.5 Flags de C/IER</w:t>
       </w:r>
     </w:p>
     <w:p>
@@ -1967,7 +2361,7 @@
         <w:t xml:space="preserve">decisão informada.</w:t>
       </w:r>
     </w:p>
-    <w:bookmarkStart w:id="52" w:name="resumo-flags"/>
+    <w:bookmarkStart w:id="73" w:name="resumo-flags"/>
     <w:p>
       <w:pPr>
         <w:pStyle w:val="TableCaption"/>
@@ -2220,7 +2614,7 @@
         </w:tc>
       </w:tr>
     </w:tbl>
-    <w:bookmarkEnd w:id="52"/>
+    <w:bookmarkEnd w:id="73"/>
     <w:p>
       <w:pPr>
         <w:pStyle w:val="BodyText"/>
@@ -2237,7 +2631,7 @@
         </w:rPr>
         <w:t xml:space="preserve"> </w:t>
       </w:r>
-      <w:hyperlink r:id="rId53">
+      <w:hyperlink r:id="rId74">
         <w:r>
           <w:rPr>
             <w:rStyle w:val="Hyperlink"/>
@@ -2247,9 +2641,9 @@
         </w:r>
       </w:hyperlink>
     </w:p>
-    <w:bookmarkEnd w:id="54"/>
-    <w:bookmarkEnd w:id="55"/>
-    <w:bookmarkStart w:id="70" w:name="multicolinearidade-nível-3"/>
+    <w:bookmarkEnd w:id="75"/>
+    <w:bookmarkEnd w:id="76"/>
+    <w:bookmarkStart w:id="91" w:name="multicolinearidade-nível-3"/>
     <w:p>
       <w:pPr>
         <w:pStyle w:val="Heading2"/>
@@ -2287,7 +2681,7 @@
         <w:t xml:space="preserve">.</w:t>
       </w:r>
     </w:p>
-    <w:bookmarkStart w:id="56" w:name="vif-tabela"/>
+    <w:bookmarkStart w:id="77" w:name="vif-tabela"/>
     <w:p>
       <w:pPr>
         <w:pStyle w:val="TableCaption"/>
@@ -3344,7 +3738,7 @@
         </w:tc>
       </w:tr>
     </w:tbl>
-    <w:bookmarkEnd w:id="56"/>
+    <w:bookmarkEnd w:id="77"/>
     <w:p>
       <w:pPr>
         <w:pStyle w:val="BodyText"/>
@@ -3361,7 +3755,7 @@
         </w:rPr>
         <w:t xml:space="preserve"> </w:t>
       </w:r>
-      <w:hyperlink r:id="rId57">
+      <w:hyperlink r:id="rId78">
         <w:r>
           <w:rPr>
             <w:rStyle w:val="Hyperlink"/>
@@ -3371,8 +3765,8 @@
         </w:r>
       </w:hyperlink>
     </w:p>
-    <w:bookmarkStart w:id="69" w:name="refs"/>
-    <w:bookmarkStart w:id="59" w:name="ref-curran2016"/>
+    <w:bookmarkStart w:id="90" w:name="refs"/>
+    <w:bookmarkStart w:id="80" w:name="ref-curran2016"/>
     <w:p>
       <w:pPr>
         <w:pStyle w:val="Bibliography"/>
@@ -3409,7 +3803,7 @@
       <w:r>
         <w:t xml:space="preserve"> </w:t>
       </w:r>
-      <w:hyperlink r:id="rId58">
+      <w:hyperlink r:id="rId79">
         <w:r>
           <w:rPr>
             <w:rStyle w:val="Hyperlink"/>
@@ -3418,8 +3812,8 @@
         </w:r>
       </w:hyperlink>
     </w:p>
-    <w:bookmarkEnd w:id="59"/>
-    <w:bookmarkStart w:id="61" w:name="ref-flora2012"/>
+    <w:bookmarkEnd w:id="80"/>
+    <w:bookmarkStart w:id="82" w:name="ref-flora2012"/>
     <w:p>
       <w:pPr>
         <w:pStyle w:val="Bibliography"/>
@@ -3456,7 +3850,7 @@
       <w:r>
         <w:t xml:space="preserve"> </w:t>
       </w:r>
-      <w:hyperlink r:id="rId60">
+      <w:hyperlink r:id="rId81">
         <w:r>
           <w:rPr>
             <w:rStyle w:val="Hyperlink"/>
@@ -3465,8 +3859,8 @@
         </w:r>
       </w:hyperlink>
     </w:p>
-    <w:bookmarkEnd w:id="61"/>
-    <w:bookmarkStart w:id="63" w:name="ref-hong2020"/>
+    <w:bookmarkEnd w:id="82"/>
+    <w:bookmarkStart w:id="84" w:name="ref-hong2020"/>
     <w:p>
       <w:pPr>
         <w:pStyle w:val="Bibliography"/>
@@ -3533,7 +3927,7 @@
       <w:r>
         <w:t xml:space="preserve"> </w:t>
       </w:r>
-      <w:hyperlink r:id="rId62">
+      <w:hyperlink r:id="rId83">
         <w:r>
           <w:rPr>
             <w:rStyle w:val="Hyperlink"/>
@@ -3542,8 +3936,8 @@
         </w:r>
       </w:hyperlink>
     </w:p>
-    <w:bookmarkEnd w:id="63"/>
-    <w:bookmarkStart w:id="65" w:name="ref-huang2026"/>
+    <w:bookmarkEnd w:id="84"/>
+    <w:bookmarkStart w:id="86" w:name="ref-huang2026"/>
     <w:p>
       <w:pPr>
         <w:pStyle w:val="Bibliography"/>
@@ -3671,7 +4065,7 @@
       <w:r>
         <w:t xml:space="preserve"> </w:t>
       </w:r>
-      <w:hyperlink r:id="rId64">
+      <w:hyperlink r:id="rId85">
         <w:r>
           <w:rPr>
             <w:rStyle w:val="Hyperlink"/>
@@ -3680,8 +4074,8 @@
         </w:r>
       </w:hyperlink>
     </w:p>
-    <w:bookmarkEnd w:id="65"/>
-    <w:bookmarkStart w:id="66" w:name="ref-kline2023"/>
+    <w:bookmarkEnd w:id="86"/>
+    <w:bookmarkStart w:id="87" w:name="ref-kline2023"/>
     <w:p>
       <w:pPr>
         <w:pStyle w:val="Bibliography"/>
@@ -3706,8 +4100,8 @@
         <w:t xml:space="preserve">(5th ed.). The Guilford Press.</w:t>
       </w:r>
     </w:p>
-    <w:bookmarkEnd w:id="66"/>
-    <w:bookmarkStart w:id="68" w:name="ref-satopaa2011"/>
+    <w:bookmarkEnd w:id="87"/>
+    <w:bookmarkStart w:id="89" w:name="ref-satopaa2011"/>
     <w:p>
       <w:pPr>
         <w:pStyle w:val="Bibliography"/>
@@ -3761,7 +4155,7 @@
       <w:r>
         <w:t xml:space="preserve"> </w:t>
       </w:r>
-      <w:hyperlink r:id="rId67">
+      <w:hyperlink r:id="rId88">
         <w:r>
           <w:rPr>
             <w:rStyle w:val="Hyperlink"/>
@@ -3770,9 +4164,9 @@
         </w:r>
       </w:hyperlink>
     </w:p>
-    <w:bookmarkEnd w:id="68"/>
-    <w:bookmarkEnd w:id="69"/>
-    <w:bookmarkEnd w:id="70"/>
+    <w:bookmarkEnd w:id="89"/>
+    <w:bookmarkEnd w:id="90"/>
+    <w:bookmarkEnd w:id="91"/>
     <w:sectPr>
       <w:footnotePr>
         <w:numRestart w:val="eachSect"/>

</xml_diff>

<commit_message>
fix: README translate and render update
</commit_message>
<xml_diff>
--- a/docs/index.docx
+++ b/docs/index.docx
@@ -66,7 +66,7 @@
         <w:t xml:space="preserve">to detect C/IER (post hoc indicators). We also discuss the importance of procedural C/IER detection in the quality control of data obtained through self-report questionnaires.</w:t>
       </w:r>
     </w:p>
-    <w:bookmarkStart w:id="20" w:name="contextualization"/>
+    <w:bookmarkStart w:id="9" w:name="contextualization"/>
     <w:p>
       <w:pPr>
         <w:pStyle w:val="Heading2"/>
@@ -195,8 +195,8 @@
         <w:t xml:space="preserve">.</w:t>
       </w:r>
     </w:p>
-    <w:bookmarkEnd w:id="20"/>
-    <w:bookmarkStart w:id="22" w:name="data-reading-and-preparation"/>
+    <w:bookmarkEnd w:id="9"/>
+    <w:bookmarkStart w:id="11" w:name="data-reading-and-preparation"/>
     <w:p>
       <w:pPr>
         <w:pStyle w:val="Heading2"/>
@@ -594,7 +594,7 @@
         </w:rPr>
         <w:t xml:space="preserve"> </w:t>
       </w:r>
-      <w:hyperlink r:id="rId21">
+      <w:hyperlink r:id="rId10">
         <w:r>
           <w:rPr>
             <w:rStyle w:val="Hyperlink"/>
@@ -604,8 +604,8 @@
         </w:r>
       </w:hyperlink>
     </w:p>
-    <w:bookmarkEnd w:id="22"/>
-    <w:bookmarkStart w:id="25" w:name="procedural-exclusions"/>
+    <w:bookmarkEnd w:id="11"/>
+    <w:bookmarkStart w:id="14" w:name="procedural-exclusions"/>
     <w:p>
       <w:pPr>
         <w:pStyle w:val="Heading2"/>
@@ -688,7 +688,7 @@
         <w:t xml:space="preserve">with its reason and criterion.</w:t>
       </w:r>
     </w:p>
-    <w:bookmarkStart w:id="23" w:name="level-1-summary"/>
+    <w:bookmarkStart w:id="12" w:name="level-1-summary"/>
     <w:p>
       <w:pPr>
         <w:pStyle w:val="TableCaption"/>
@@ -920,7 +920,7 @@
         </w:tc>
       </w:tr>
     </w:tbl>
-    <w:bookmarkEnd w:id="23"/>
+    <w:bookmarkEnd w:id="12"/>
     <w:p>
       <w:pPr>
         <w:pStyle w:val="BodyText"/>
@@ -937,7 +937,7 @@
         </w:rPr>
         <w:t xml:space="preserve"> </w:t>
       </w:r>
-      <w:hyperlink r:id="rId24">
+      <w:hyperlink r:id="rId13">
         <w:r>
           <w:rPr>
             <w:rStyle w:val="Hyperlink"/>
@@ -947,8 +947,8 @@
         </w:r>
       </w:hyperlink>
     </w:p>
-    <w:bookmarkEnd w:id="25"/>
-    <w:bookmarkStart w:id="83" w:name="calculation-of-cier-indicators"/>
+    <w:bookmarkEnd w:id="14"/>
+    <w:bookmarkStart w:id="72" w:name="calculation-of-cier-indicators"/>
     <w:p>
       <w:pPr>
         <w:pStyle w:val="Heading2"/>
@@ -980,7 +980,7 @@
         <w:t xml:space="preserve">.</w:t>
       </w:r>
     </w:p>
-    <w:bookmarkStart w:id="46" w:name="univariate-visualization"/>
+    <w:bookmarkStart w:id="35" w:name="univariate-visualization"/>
     <w:p>
       <w:pPr>
         <w:pStyle w:val="Heading3"/>
@@ -1015,24 +1015,24 @@
       <w:pPr>
         <w:pStyle w:val="FirstParagraph"/>
       </w:pPr>
-      <w:bookmarkStart w:id="29" w:name="viz-lazr"/>
+      <w:bookmarkStart w:id="18" w:name="viz-lazr"/>
       <w:r>
         <w:drawing>
           <wp:inline>
             <wp:extent cx="5334000" cy="3810000"/>
             <wp:effectExtent b="0" l="0" r="0" t="0"/>
-            <wp:docPr descr="" title="" id="27" name="Picture"/>
+            <wp:docPr descr="" title="" id="16" name="Picture"/>
             <a:graphic>
               <a:graphicData uri="http://schemas.openxmlformats.org/drawingml/2006/picture">
                 <pic:pic>
                   <pic:nvPicPr>
-                    <pic:cNvPr descr="index_files/figure-docx/Scripts-ProcessingScripts-02_posthoc-viz-lazr-output-1.png" id="28" name="Picture"/>
+                    <pic:cNvPr descr="index_files/figure-docx/Scripts-ProcessingScripts-02_posthoc-viz-lazr-output-1.png" id="17" name="Picture"/>
                     <pic:cNvPicPr>
                       <a:picLocks noChangeArrowheads="1" noChangeAspect="1"/>
                     </pic:cNvPicPr>
                   </pic:nvPicPr>
                   <pic:blipFill>
-                    <a:blip r:embed="rId26"/>
+                    <a:blip r:embed="rId15"/>
                     <a:stretch>
                       <a:fillRect/>
                     </a:stretch>
@@ -1058,7 +1058,7 @@
           </wp:inline>
         </w:drawing>
       </w:r>
-      <w:bookmarkEnd w:id="29"/>
+      <w:bookmarkEnd w:id="18"/>
     </w:p>
     <w:p>
       <w:pPr>
@@ -1076,7 +1076,7 @@
         </w:rPr>
         <w:t xml:space="preserve"> </w:t>
       </w:r>
-      <w:hyperlink r:id="rId30">
+      <w:hyperlink r:id="rId19">
         <w:r>
           <w:rPr>
             <w:rStyle w:val="Hyperlink"/>
@@ -1098,24 +1098,24 @@
       <w:pPr>
         <w:pStyle w:val="FirstParagraph"/>
       </w:pPr>
-      <w:bookmarkStart w:id="34" w:name="viz-longstr"/>
+      <w:bookmarkStart w:id="23" w:name="viz-longstr"/>
       <w:r>
         <w:drawing>
           <wp:inline>
             <wp:extent cx="5334000" cy="3810000"/>
             <wp:effectExtent b="0" l="0" r="0" t="0"/>
-            <wp:docPr descr="" title="" id="32" name="Picture"/>
+            <wp:docPr descr="" title="" id="21" name="Picture"/>
             <a:graphic>
               <a:graphicData uri="http://schemas.openxmlformats.org/drawingml/2006/picture">
                 <pic:pic>
                   <pic:nvPicPr>
-                    <pic:cNvPr descr="index_files/figure-docx/Scripts-ProcessingScripts-02_posthoc-viz-longstr-output-1.png" id="33" name="Picture"/>
+                    <pic:cNvPr descr="index_files/figure-docx/Scripts-ProcessingScripts-02_posthoc-viz-longstr-output-1.png" id="22" name="Picture"/>
                     <pic:cNvPicPr>
                       <a:picLocks noChangeArrowheads="1" noChangeAspect="1"/>
                     </pic:cNvPicPr>
                   </pic:nvPicPr>
                   <pic:blipFill>
-                    <a:blip r:embed="rId31"/>
+                    <a:blip r:embed="rId20"/>
                     <a:stretch>
                       <a:fillRect/>
                     </a:stretch>
@@ -1141,7 +1141,7 @@
           </wp:inline>
         </w:drawing>
       </w:r>
-      <w:bookmarkEnd w:id="34"/>
+      <w:bookmarkEnd w:id="23"/>
     </w:p>
     <w:p>
       <w:pPr>
@@ -1159,7 +1159,7 @@
         </w:rPr>
         <w:t xml:space="preserve"> </w:t>
       </w:r>
-      <w:hyperlink r:id="rId35">
+      <w:hyperlink r:id="rId24">
         <w:r>
           <w:rPr>
             <w:rStyle w:val="Hyperlink"/>
@@ -1181,24 +1181,24 @@
       <w:pPr>
         <w:pStyle w:val="FirstParagraph"/>
       </w:pPr>
-      <w:bookmarkStart w:id="39" w:name="viz-md"/>
+      <w:bookmarkStart w:id="28" w:name="viz-md"/>
       <w:r>
         <w:drawing>
           <wp:inline>
             <wp:extent cx="5334000" cy="3810000"/>
             <wp:effectExtent b="0" l="0" r="0" t="0"/>
-            <wp:docPr descr="" title="" id="37" name="Picture"/>
+            <wp:docPr descr="" title="" id="26" name="Picture"/>
             <a:graphic>
               <a:graphicData uri="http://schemas.openxmlformats.org/drawingml/2006/picture">
                 <pic:pic>
                   <pic:nvPicPr>
-                    <pic:cNvPr descr="index_files/figure-docx/Scripts-ProcessingScripts-02_posthoc-viz-md-output-1.png" id="38" name="Picture"/>
+                    <pic:cNvPr descr="index_files/figure-docx/Scripts-ProcessingScripts-02_posthoc-viz-md-output-1.png" id="27" name="Picture"/>
                     <pic:cNvPicPr>
                       <a:picLocks noChangeArrowheads="1" noChangeAspect="1"/>
                     </pic:cNvPicPr>
                   </pic:nvPicPr>
                   <pic:blipFill>
-                    <a:blip r:embed="rId36"/>
+                    <a:blip r:embed="rId25"/>
                     <a:stretch>
                       <a:fillRect/>
                     </a:stretch>
@@ -1224,7 +1224,7 @@
           </wp:inline>
         </w:drawing>
       </w:r>
-      <w:bookmarkEnd w:id="39"/>
+      <w:bookmarkEnd w:id="28"/>
     </w:p>
     <w:p>
       <w:pPr>
@@ -1242,7 +1242,7 @@
         </w:rPr>
         <w:t xml:space="preserve"> </w:t>
       </w:r>
-      <w:hyperlink r:id="rId40">
+      <w:hyperlink r:id="rId29">
         <w:r>
           <w:rPr>
             <w:rStyle w:val="Hyperlink"/>
@@ -1264,24 +1264,24 @@
       <w:pPr>
         <w:pStyle w:val="FirstParagraph"/>
       </w:pPr>
-      <w:bookmarkStart w:id="44" w:name="viz-irv"/>
+      <w:bookmarkStart w:id="33" w:name="viz-irv"/>
       <w:r>
         <w:drawing>
           <wp:inline>
             <wp:extent cx="5334000" cy="3810000"/>
             <wp:effectExtent b="0" l="0" r="0" t="0"/>
-            <wp:docPr descr="" title="" id="42" name="Picture"/>
+            <wp:docPr descr="" title="" id="31" name="Picture"/>
             <a:graphic>
               <a:graphicData uri="http://schemas.openxmlformats.org/drawingml/2006/picture">
                 <pic:pic>
                   <pic:nvPicPr>
-                    <pic:cNvPr descr="index_files/figure-docx/Scripts-ProcessingScripts-02_posthoc-viz-irv-output-1.png" id="43" name="Picture"/>
+                    <pic:cNvPr descr="index_files/figure-docx/Scripts-ProcessingScripts-02_posthoc-viz-irv-output-1.png" id="32" name="Picture"/>
                     <pic:cNvPicPr>
                       <a:picLocks noChangeArrowheads="1" noChangeAspect="1"/>
                     </pic:cNvPicPr>
                   </pic:nvPicPr>
                   <pic:blipFill>
-                    <a:blip r:embed="rId41"/>
+                    <a:blip r:embed="rId30"/>
                     <a:stretch>
                       <a:fillRect/>
                     </a:stretch>
@@ -1307,7 +1307,7 @@
           </wp:inline>
         </w:drawing>
       </w:r>
-      <w:bookmarkEnd w:id="44"/>
+      <w:bookmarkEnd w:id="33"/>
     </w:p>
     <w:p>
       <w:pPr>
@@ -1325,7 +1325,7 @@
         </w:rPr>
         <w:t xml:space="preserve"> </w:t>
       </w:r>
-      <w:hyperlink r:id="rId45">
+      <w:hyperlink r:id="rId34">
         <w:r>
           <w:rPr>
             <w:rStyle w:val="Hyperlink"/>
@@ -1335,8 +1335,8 @@
         </w:r>
       </w:hyperlink>
     </w:p>
-    <w:bookmarkEnd w:id="46"/>
-    <w:bookmarkStart w:id="49" w:name="cut-off-points-via-kneedle-algorithm"/>
+    <w:bookmarkEnd w:id="35"/>
+    <w:bookmarkStart w:id="38" w:name="cut-off-points-via-kneedle-algorithm"/>
     <w:p>
       <w:pPr>
         <w:pStyle w:val="Heading3"/>
@@ -1468,7 +1468,7 @@
         <w:t xml:space="preserve">for excessively low IRV, since both extremes can be considered suspicious.</w:t>
       </w:r>
     </w:p>
-    <w:bookmarkStart w:id="47" w:name="kneedle-cutoffs"/>
+    <w:bookmarkStart w:id="36" w:name="kneedle-cutoffs"/>
     <w:p>
       <w:pPr>
         <w:pStyle w:val="TableCaption"/>
@@ -1721,7 +1721,7 @@
         </w:tc>
       </w:tr>
     </w:tbl>
-    <w:bookmarkEnd w:id="47"/>
+    <w:bookmarkEnd w:id="36"/>
     <w:p>
       <w:pPr>
         <w:pStyle w:val="BodyText"/>
@@ -1738,7 +1738,7 @@
         </w:rPr>
         <w:t xml:space="preserve"> </w:t>
       </w:r>
-      <w:hyperlink r:id="rId48">
+      <w:hyperlink r:id="rId37">
         <w:r>
           <w:rPr>
             <w:rStyle w:val="Hyperlink"/>
@@ -1748,8 +1748,8 @@
         </w:r>
       </w:hyperlink>
     </w:p>
-    <w:bookmarkEnd w:id="49"/>
-    <w:bookmarkStart w:id="70" w:name="plots-with-cut-off-points"/>
+    <w:bookmarkEnd w:id="38"/>
+    <w:bookmarkStart w:id="59" w:name="plots-with-cut-off-points"/>
     <w:p>
       <w:pPr>
         <w:pStyle w:val="Heading3"/>
@@ -1770,24 +1770,24 @@
       <w:pPr>
         <w:pStyle w:val="FirstParagraph"/>
       </w:pPr>
-      <w:bookmarkStart w:id="53" w:name="cum-lazr"/>
+      <w:bookmarkStart w:id="42" w:name="cum-lazr"/>
       <w:r>
         <w:drawing>
           <wp:inline>
             <wp:extent cx="5334000" cy="3810000"/>
             <wp:effectExtent b="0" l="0" r="0" t="0"/>
-            <wp:docPr descr="" title="" id="51" name="Picture"/>
+            <wp:docPr descr="" title="" id="40" name="Picture"/>
             <a:graphic>
               <a:graphicData uri="http://schemas.openxmlformats.org/drawingml/2006/picture">
                 <pic:pic>
                   <pic:nvPicPr>
-                    <pic:cNvPr descr="index_files/figure-docx/Scripts-ProcessingScripts-02_posthoc-cum-lazr-output-1.png" id="52" name="Picture"/>
+                    <pic:cNvPr descr="index_files/figure-docx/Scripts-ProcessingScripts-02_posthoc-cum-lazr-output-1.png" id="41" name="Picture"/>
                     <pic:cNvPicPr>
                       <a:picLocks noChangeArrowheads="1" noChangeAspect="1"/>
                     </pic:cNvPicPr>
                   </pic:nvPicPr>
                   <pic:blipFill>
-                    <a:blip r:embed="rId50"/>
+                    <a:blip r:embed="rId39"/>
                     <a:stretch>
                       <a:fillRect/>
                     </a:stretch>
@@ -1813,7 +1813,7 @@
           </wp:inline>
         </w:drawing>
       </w:r>
-      <w:bookmarkEnd w:id="53"/>
+      <w:bookmarkEnd w:id="42"/>
     </w:p>
     <w:p>
       <w:pPr>
@@ -1831,7 +1831,7 @@
         </w:rPr>
         <w:t xml:space="preserve"> </w:t>
       </w:r>
-      <w:hyperlink r:id="rId54">
+      <w:hyperlink r:id="rId43">
         <w:r>
           <w:rPr>
             <w:rStyle w:val="Hyperlink"/>
@@ -1853,24 +1853,24 @@
       <w:pPr>
         <w:pStyle w:val="FirstParagraph"/>
       </w:pPr>
-      <w:bookmarkStart w:id="58" w:name="cum-longstr"/>
+      <w:bookmarkStart w:id="47" w:name="cum-longstr"/>
       <w:r>
         <w:drawing>
           <wp:inline>
             <wp:extent cx="5334000" cy="3810000"/>
             <wp:effectExtent b="0" l="0" r="0" t="0"/>
-            <wp:docPr descr="" title="" id="56" name="Picture"/>
+            <wp:docPr descr="" title="" id="45" name="Picture"/>
             <a:graphic>
               <a:graphicData uri="http://schemas.openxmlformats.org/drawingml/2006/picture">
                 <pic:pic>
                   <pic:nvPicPr>
-                    <pic:cNvPr descr="index_files/figure-docx/Scripts-ProcessingScripts-02_posthoc-cum-longstr-output-1.png" id="57" name="Picture"/>
+                    <pic:cNvPr descr="index_files/figure-docx/Scripts-ProcessingScripts-02_posthoc-cum-longstr-output-1.png" id="46" name="Picture"/>
                     <pic:cNvPicPr>
                       <a:picLocks noChangeArrowheads="1" noChangeAspect="1"/>
                     </pic:cNvPicPr>
                   </pic:nvPicPr>
                   <pic:blipFill>
-                    <a:blip r:embed="rId55"/>
+                    <a:blip r:embed="rId44"/>
                     <a:stretch>
                       <a:fillRect/>
                     </a:stretch>
@@ -1896,7 +1896,7 @@
           </wp:inline>
         </w:drawing>
       </w:r>
-      <w:bookmarkEnd w:id="58"/>
+      <w:bookmarkEnd w:id="47"/>
     </w:p>
     <w:p>
       <w:pPr>
@@ -1914,7 +1914,7 @@
         </w:rPr>
         <w:t xml:space="preserve"> </w:t>
       </w:r>
-      <w:hyperlink r:id="rId59">
+      <w:hyperlink r:id="rId48">
         <w:r>
           <w:rPr>
             <w:rStyle w:val="Hyperlink"/>
@@ -1936,24 +1936,24 @@
       <w:pPr>
         <w:pStyle w:val="FirstParagraph"/>
       </w:pPr>
-      <w:bookmarkStart w:id="63" w:name="cum-md"/>
+      <w:bookmarkStart w:id="52" w:name="cum-md"/>
       <w:r>
         <w:drawing>
           <wp:inline>
             <wp:extent cx="5334000" cy="3810000"/>
             <wp:effectExtent b="0" l="0" r="0" t="0"/>
-            <wp:docPr descr="" title="" id="61" name="Picture"/>
+            <wp:docPr descr="" title="" id="50" name="Picture"/>
             <a:graphic>
               <a:graphicData uri="http://schemas.openxmlformats.org/drawingml/2006/picture">
                 <pic:pic>
                   <pic:nvPicPr>
-                    <pic:cNvPr descr="index_files/figure-docx/Scripts-ProcessingScripts-02_posthoc-cum-md-output-1.png" id="62" name="Picture"/>
+                    <pic:cNvPr descr="index_files/figure-docx/Scripts-ProcessingScripts-02_posthoc-cum-md-output-1.png" id="51" name="Picture"/>
                     <pic:cNvPicPr>
                       <a:picLocks noChangeArrowheads="1" noChangeAspect="1"/>
                     </pic:cNvPicPr>
                   </pic:nvPicPr>
                   <pic:blipFill>
-                    <a:blip r:embed="rId60"/>
+                    <a:blip r:embed="rId49"/>
                     <a:stretch>
                       <a:fillRect/>
                     </a:stretch>
@@ -1979,7 +1979,7 @@
           </wp:inline>
         </w:drawing>
       </w:r>
-      <w:bookmarkEnd w:id="63"/>
+      <w:bookmarkEnd w:id="52"/>
     </w:p>
     <w:p>
       <w:pPr>
@@ -1997,7 +1997,7 @@
         </w:rPr>
         <w:t xml:space="preserve"> </w:t>
       </w:r>
-      <w:hyperlink r:id="rId64">
+      <w:hyperlink r:id="rId53">
         <w:r>
           <w:rPr>
             <w:rStyle w:val="Hyperlink"/>
@@ -2019,24 +2019,24 @@
       <w:pPr>
         <w:pStyle w:val="FirstParagraph"/>
       </w:pPr>
-      <w:bookmarkStart w:id="68" w:name="cum-irv"/>
+      <w:bookmarkStart w:id="57" w:name="cum-irv"/>
       <w:r>
         <w:drawing>
           <wp:inline>
             <wp:extent cx="5334000" cy="3810000"/>
             <wp:effectExtent b="0" l="0" r="0" t="0"/>
-            <wp:docPr descr="" title="" id="66" name="Picture"/>
+            <wp:docPr descr="" title="" id="55" name="Picture"/>
             <a:graphic>
               <a:graphicData uri="http://schemas.openxmlformats.org/drawingml/2006/picture">
                 <pic:pic>
                   <pic:nvPicPr>
-                    <pic:cNvPr descr="index_files/figure-docx/Scripts-ProcessingScripts-02_posthoc-cum-irv-output-1.png" id="67" name="Picture"/>
+                    <pic:cNvPr descr="index_files/figure-docx/Scripts-ProcessingScripts-02_posthoc-cum-irv-output-1.png" id="56" name="Picture"/>
                     <pic:cNvPicPr>
                       <a:picLocks noChangeArrowheads="1" noChangeAspect="1"/>
                     </pic:cNvPicPr>
                   </pic:nvPicPr>
                   <pic:blipFill>
-                    <a:blip r:embed="rId65"/>
+                    <a:blip r:embed="rId54"/>
                     <a:stretch>
                       <a:fillRect/>
                     </a:stretch>
@@ -2062,7 +2062,7 @@
           </wp:inline>
         </w:drawing>
       </w:r>
-      <w:bookmarkEnd w:id="68"/>
+      <w:bookmarkEnd w:id="57"/>
     </w:p>
     <w:p>
       <w:pPr>
@@ -2080,7 +2080,7 @@
         </w:rPr>
         <w:t xml:space="preserve"> </w:t>
       </w:r>
-      <w:hyperlink r:id="rId69">
+      <w:hyperlink r:id="rId58">
         <w:r>
           <w:rPr>
             <w:rStyle w:val="Hyperlink"/>
@@ -2090,8 +2090,8 @@
         </w:r>
       </w:hyperlink>
     </w:p>
-    <w:bookmarkEnd w:id="70"/>
-    <w:bookmarkStart w:id="82" w:name="cier-flags"/>
+    <w:bookmarkEnd w:id="59"/>
+    <w:bookmarkStart w:id="71" w:name="cier-flags"/>
     <w:p>
       <w:pPr>
         <w:pStyle w:val="Heading3"/>
@@ -2208,7 +2208,7 @@
         <w:t xml:space="preserve">file.</w:t>
       </w:r>
     </w:p>
-    <w:bookmarkStart w:id="71" w:name="flags-overview"/>
+    <w:bookmarkStart w:id="60" w:name="flags-overview"/>
     <w:p>
       <w:pPr>
         <w:pStyle w:val="TableCaption"/>
@@ -2461,7 +2461,7 @@
         </w:tc>
       </w:tr>
     </w:tbl>
-    <w:bookmarkEnd w:id="71"/>
+    <w:bookmarkEnd w:id="60"/>
     <w:p>
       <w:pPr>
         <w:pStyle w:val="BodyText"/>
@@ -2478,7 +2478,7 @@
         </w:rPr>
         <w:t xml:space="preserve"> </w:t>
       </w:r>
-      <w:hyperlink r:id="rId72">
+      <w:hyperlink r:id="rId61">
         <w:r>
           <w:rPr>
             <w:rStyle w:val="Hyperlink"/>
@@ -2488,8 +2488,8 @@
         </w:r>
       </w:hyperlink>
     </w:p>
-    <w:bookmarkStart w:id="81" w:name="refs"/>
-    <w:bookmarkStart w:id="74" w:name="ref-biemann2025"/>
+    <w:bookmarkStart w:id="70" w:name="refs"/>
+    <w:bookmarkStart w:id="63" w:name="ref-biemann2025"/>
     <w:p>
       <w:pPr>
         <w:pStyle w:val="Bibliography"/>
@@ -2559,7 +2559,7 @@
       <w:r>
         <w:t xml:space="preserve"> </w:t>
       </w:r>
-      <w:hyperlink r:id="rId73">
+      <w:hyperlink r:id="rId62">
         <w:r>
           <w:rPr>
             <w:rStyle w:val="Hyperlink"/>
@@ -2568,8 +2568,8 @@
         </w:r>
       </w:hyperlink>
     </w:p>
-    <w:bookmarkEnd w:id="74"/>
-    <w:bookmarkStart w:id="76" w:name="ref-curran2016"/>
+    <w:bookmarkEnd w:id="63"/>
+    <w:bookmarkStart w:id="65" w:name="ref-curran2016"/>
     <w:p>
       <w:pPr>
         <w:pStyle w:val="Bibliography"/>
@@ -2606,7 +2606,7 @@
       <w:r>
         <w:t xml:space="preserve"> </w:t>
       </w:r>
-      <w:hyperlink r:id="rId75">
+      <w:hyperlink r:id="rId64">
         <w:r>
           <w:rPr>
             <w:rStyle w:val="Hyperlink"/>
@@ -2615,8 +2615,8 @@
         </w:r>
       </w:hyperlink>
     </w:p>
-    <w:bookmarkEnd w:id="76"/>
-    <w:bookmarkStart w:id="78" w:name="ref-hong2020"/>
+    <w:bookmarkEnd w:id="65"/>
+    <w:bookmarkStart w:id="67" w:name="ref-hong2020"/>
     <w:p>
       <w:pPr>
         <w:pStyle w:val="Bibliography"/>
@@ -2683,7 +2683,7 @@
       <w:r>
         <w:t xml:space="preserve"> </w:t>
       </w:r>
-      <w:hyperlink r:id="rId77">
+      <w:hyperlink r:id="rId66">
         <w:r>
           <w:rPr>
             <w:rStyle w:val="Hyperlink"/>
@@ -2692,8 +2692,8 @@
         </w:r>
       </w:hyperlink>
     </w:p>
-    <w:bookmarkEnd w:id="78"/>
-    <w:bookmarkStart w:id="80" w:name="ref-huang2026"/>
+    <w:bookmarkEnd w:id="67"/>
+    <w:bookmarkStart w:id="69" w:name="ref-huang2026"/>
     <w:p>
       <w:pPr>
         <w:pStyle w:val="Bibliography"/>
@@ -2821,7 +2821,7 @@
       <w:r>
         <w:t xml:space="preserve"> </w:t>
       </w:r>
-      <w:hyperlink r:id="rId79">
+      <w:hyperlink r:id="rId68">
         <w:r>
           <w:rPr>
             <w:rStyle w:val="Hyperlink"/>
@@ -2830,10 +2830,10 @@
         </w:r>
       </w:hyperlink>
     </w:p>
-    <w:bookmarkEnd w:id="80"/>
-    <w:bookmarkEnd w:id="81"/>
-    <w:bookmarkEnd w:id="82"/>
-    <w:bookmarkEnd w:id="83"/>
+    <w:bookmarkEnd w:id="69"/>
+    <w:bookmarkEnd w:id="70"/>
+    <w:bookmarkEnd w:id="71"/>
+    <w:bookmarkEnd w:id="72"/>
     <w:sectPr>
       <w:footnotePr>
         <w:numRestart w:val="eachSect"/>
@@ -3070,10 +3070,10 @@
   <w:docDefaults>
     <w:rPrDefault>
       <w:rPr>
-        <w:rFonts w:asciiTheme="minorHAnsi" w:cstheme="minorBidi" w:eastAsiaTheme="minorHAnsi" w:hAnsiTheme="minorHAnsi"/>
+        <w:rFonts w:asciiTheme="minorHAnsi" w:cstheme="minorBidi" w:eastAsiaTheme="minorEastAsia" w:hAnsiTheme="minorHAnsi"/>
         <w:sz w:val="24"/>
         <w:szCs w:val="24"/>
-        <w:lang w:bidi="ar-SA" w:eastAsia="en-US" w:val="en-US"/>
+        <w:lang w:bidi="ar-SA" w:eastAsia="zh-CN" w:val="en-US"/>
       </w:rPr>
     </w:rPrDefault>
     <w:pPrDefault>
@@ -3614,13 +3614,6 @@
       </w:tblCellMar>
     </w:tblPr>
     <w:tblStylePr w:type="firstRow">
-      <w:tblPr>
-        <w:jc w:val="left"/>
-        <w:tblInd w:type="dxa" w:w="0"/>
-      </w:tblPr>
-      <w:trPr>
-        <w:jc w:val="left"/>
-      </w:trPr>
       <w:tcPr>
         <w:tcBorders>
           <w:bottom w:val="single"/>

</xml_diff>

<commit_message>
fix: reversed items to final analysis
</commit_message>
<xml_diff>
--- a/docs/index.docx
+++ b/docs/index.docx
@@ -1563,7 +1563,7 @@
               <w:jc w:val="right"/>
             </w:pPr>
             <w:r>
-              <w:t xml:space="preserve">11.6</w:t>
+              <w:t xml:space="preserve">6.8</w:t>
             </w:r>
           </w:p>
         </w:tc>
@@ -1601,7 +1601,7 @@
               <w:jc w:val="right"/>
             </w:pPr>
             <w:r>
-              <w:t xml:space="preserve">15.2</w:t>
+              <w:t xml:space="preserve">14.8</w:t>
             </w:r>
           </w:p>
         </w:tc>
@@ -1665,7 +1665,7 @@
               <w:jc w:val="right"/>
             </w:pPr>
             <w:r>
-              <w:t xml:space="preserve">1.14</w:t>
+              <w:t xml:space="preserve">1.34</w:t>
             </w:r>
           </w:p>
         </w:tc>
@@ -1677,7 +1677,7 @@
               <w:jc w:val="right"/>
             </w:pPr>
             <w:r>
-              <w:t xml:space="preserve">8.0</w:t>
+              <w:t xml:space="preserve">4.9</w:t>
             </w:r>
           </w:p>
         </w:tc>
@@ -1703,7 +1703,7 @@
               <w:jc w:val="right"/>
             </w:pPr>
             <w:r>
-              <w:t xml:space="preserve">0.48</w:t>
+              <w:t xml:space="preserve">0.69</w:t>
             </w:r>
           </w:p>
         </w:tc>
@@ -1715,7 +1715,7 @@
               <w:jc w:val="right"/>
             </w:pPr>
             <w:r>
-              <w:t xml:space="preserve">5.0</w:t>
+              <w:t xml:space="preserve">3.8</w:t>
             </w:r>
           </w:p>
         </w:tc>
@@ -2291,7 +2291,7 @@
               <w:jc w:val="right"/>
             </w:pPr>
             <w:r>
-              <w:t xml:space="preserve">152</w:t>
+              <w:t xml:space="preserve">91</w:t>
             </w:r>
           </w:p>
         </w:tc>
@@ -2303,7 +2303,7 @@
               <w:jc w:val="right"/>
             </w:pPr>
             <w:r>
-              <w:t xml:space="preserve">11.7</w:t>
+              <w:t xml:space="preserve">7.0</w:t>
             </w:r>
           </w:p>
         </w:tc>
@@ -2329,7 +2329,7 @@
               <w:jc w:val="right"/>
             </w:pPr>
             <w:r>
-              <w:t xml:space="preserve">196</w:t>
+              <w:t xml:space="preserve">191</w:t>
             </w:r>
           </w:p>
         </w:tc>
@@ -2341,7 +2341,7 @@
               <w:jc w:val="right"/>
             </w:pPr>
             <w:r>
-              <w:t xml:space="preserve">15.1</w:t>
+              <w:t xml:space="preserve">14.7</w:t>
             </w:r>
           </w:p>
         </w:tc>
@@ -2405,7 +2405,7 @@
               <w:jc w:val="right"/>
             </w:pPr>
             <w:r>
-              <w:t xml:space="preserve">108</w:t>
+              <w:t xml:space="preserve">66</w:t>
             </w:r>
           </w:p>
         </w:tc>
@@ -2417,7 +2417,7 @@
               <w:jc w:val="right"/>
             </w:pPr>
             <w:r>
-              <w:t xml:space="preserve">8.3</w:t>
+              <w:t xml:space="preserve">5.1</w:t>
             </w:r>
           </w:p>
         </w:tc>
@@ -2443,7 +2443,7 @@
               <w:jc w:val="right"/>
             </w:pPr>
             <w:r>
-              <w:t xml:space="preserve">65</w:t>
+              <w:t xml:space="preserve">49</w:t>
             </w:r>
           </w:p>
         </w:tc>
@@ -2455,7 +2455,7 @@
               <w:jc w:val="right"/>
             </w:pPr>
             <w:r>
-              <w:t xml:space="preserve">5.0</w:t>
+              <w:t xml:space="preserve">3.8</w:t>
             </w:r>
           </w:p>
         </w:tc>

</xml_diff>

<commit_message>
feat: decision rule exclusion
</commit_message>
<xml_diff>
--- a/docs/index.docx
+++ b/docs/index.docx
@@ -948,7 +948,7 @@
       </w:hyperlink>
     </w:p>
     <w:bookmarkEnd w:id="14"/>
-    <w:bookmarkStart w:id="56" w:name="calculation-of-cier-indicators"/>
+    <w:bookmarkStart w:id="75" w:name="calculation-of-cier-indicators"/>
     <w:p>
       <w:pPr>
         <w:pStyle w:val="Heading2"/>
@@ -1867,7 +1867,7 @@
       </w:r>
     </w:p>
     <w:bookmarkEnd w:id="43"/>
-    <w:bookmarkStart w:id="55" w:name="cier-flags"/>
+    <w:bookmarkStart w:id="46" w:name="cier-flags"/>
     <w:p>
       <w:pPr>
         <w:pStyle w:val="Heading3"/>
@@ -1960,28 +1960,13 @@
         <w:t xml:space="preserve"> </w:t>
       </w:r>
       <w:r>
-        <w:t xml:space="preserve">exclusion in this phase. The composite flag array will be used for inspection and</w:t>
-      </w:r>
-      <w:r>
-        <w:t xml:space="preserve"> </w:t>
-      </w:r>
-      <w:r>
-        <w:t xml:space="preserve">evaluation through the</w:t>
-      </w:r>
-      <w:r>
-        <w:t xml:space="preserve"> </w:t>
-      </w:r>
-      <w:r>
-        <w:rPr>
-          <w:rStyle w:val="VerbatimChar"/>
-        </w:rPr>
-        <w:t xml:space="preserve">whoqol_screened.csv</w:t>
-      </w:r>
-      <w:r>
-        <w:t xml:space="preserve"> </w:t>
-      </w:r>
-      <w:r>
-        <w:t xml:space="preserve">file.</w:t>
+        <w:t xml:space="preserve">exclusion in isolation. The final decision below requires corroboration from</w:t>
+      </w:r>
+      <w:r>
+        <w:t xml:space="preserve"> </w:t>
+      </w:r>
+      <w:r>
+        <w:t xml:space="preserve">at least two of four selected indicators.</w:t>
       </w:r>
     </w:p>
     <w:bookmarkStart w:id="44" w:name="flags-overview"/>
@@ -2264,8 +2249,2463 @@
         </w:r>
       </w:hyperlink>
     </w:p>
-    <w:bookmarkStart w:id="54" w:name="refs"/>
-    <w:bookmarkStart w:id="47" w:name="ref-biemann2025"/>
+    <w:bookmarkEnd w:id="46"/>
+    <w:bookmarkStart w:id="74" w:name="posthoc-decision"/>
+    <w:p>
+      <w:pPr>
+        <w:pStyle w:val="Heading3"/>
+      </w:pPr>
+      <w:r>
+        <w:t xml:space="preserve">4.5 From diagnostic flags to final exclusions</w:t>
+      </w:r>
+    </w:p>
+    <w:p>
+      <w:pPr>
+        <w:pStyle w:val="FirstParagraph"/>
+      </w:pPr>
+      <w:r>
+        <w:t xml:space="preserve">The cut-offs above identify response patterns that warrant attention; they do</w:t>
+      </w:r>
+      <w:r>
+        <w:t xml:space="preserve"> </w:t>
+      </w:r>
+      <w:r>
+        <w:t xml:space="preserve">not, by themselves, prove that a respondent answered carelessly. Detection</w:t>
+      </w:r>
+      <w:r>
+        <w:t xml:space="preserve"> </w:t>
+      </w:r>
+      <w:r>
+        <w:t xml:space="preserve">methods are sensitive to different manifestations of C/IER and may also flag</w:t>
+      </w:r>
+      <w:r>
+        <w:t xml:space="preserve"> </w:t>
+      </w:r>
+      <w:r>
+        <w:t xml:space="preserve">unusual but valid response profiles. Consequently, combining every available</w:t>
+      </w:r>
+      <w:r>
+        <w:t xml:space="preserve"> </w:t>
+      </w:r>
+      <w:r>
+        <w:t xml:space="preserve">flag with an</w:t>
+      </w:r>
+      <w:r>
+        <w:t xml:space="preserve"> </w:t>
+      </w:r>
+      <w:r>
+        <w:rPr>
+          <w:b/>
+          <w:bCs/>
+        </w:rPr>
+        <w:t xml:space="preserve">OR</w:t>
+      </w:r>
+      <w:r>
+        <w:t xml:space="preserve"> </w:t>
+      </w:r>
+      <w:r>
+        <w:t xml:space="preserve">rule can increase sensitivity at the cost of specificity</w:t>
+      </w:r>
+      <w:r>
+        <w:t xml:space="preserve"> </w:t>
+      </w:r>
+      <w:r>
+        <w:t xml:space="preserve">and sample size</w:t>
+      </w:r>
+      <w:r>
+        <w:t xml:space="preserve"> </w:t>
+      </w:r>
+      <w:r>
+        <w:t xml:space="preserve">(Curran, 2016; Hong et al., 2020)</w:t>
+      </w:r>
+      <w:r>
+        <w:t xml:space="preserve">. Indiscriminate post-hoc removal may</w:t>
+      </w:r>
+      <w:r>
+        <w:t xml:space="preserve"> </w:t>
+      </w:r>
+      <w:r>
+        <w:t xml:space="preserve">also distort statistical and psychometric estimates when valid atypical</w:t>
+      </w:r>
+      <w:r>
+        <w:t xml:space="preserve"> </w:t>
+      </w:r>
+      <w:r>
+        <w:t xml:space="preserve">respondents are classified as inattentive</w:t>
+      </w:r>
+      <w:r>
+        <w:t xml:space="preserve"> </w:t>
+      </w:r>
+      <w:r>
+        <w:t xml:space="preserve">(Wang et al., 2025)</w:t>
+      </w:r>
+      <w:r>
+        <w:t xml:space="preserve">.</w:t>
+      </w:r>
+    </w:p>
+    <w:bookmarkStart w:id="49" w:name="X8686f2e1359f65159f630da4d7ee3662558b3cb"/>
+    <w:p>
+      <w:pPr>
+        <w:pStyle w:val="Heading4"/>
+      </w:pPr>
+      <w:r>
+        <w:t xml:space="preserve">4.5.1 Consequences of alternative decision rules</w:t>
+      </w:r>
+    </w:p>
+    <w:p>
+      <w:pPr>
+        <w:pStyle w:val="FirstParagraph"/>
+      </w:pPr>
+      <w:r>
+        <w:t xml:space="preserve">The scenarios below make the cost of each possible rule explicit. The first</w:t>
+      </w:r>
+      <w:r>
+        <w:t xml:space="preserve"> </w:t>
+      </w:r>
+      <w:r>
+        <w:t xml:space="preserve">two use all five diagnostic flags. The next two remove Longstring from the</w:t>
+      </w:r>
+      <w:r>
+        <w:t xml:space="preserve"> </w:t>
+      </w:r>
+      <w:r>
+        <w:t xml:space="preserve">decision set, while retaining it as a descriptive diagnostic. The final two</w:t>
+      </w:r>
+      <w:r>
+        <w:t xml:space="preserve"> </w:t>
+      </w:r>
+      <w:r>
+        <w:t xml:space="preserve">show the Laz.R–MD screening alternative.</w:t>
+      </w:r>
+    </w:p>
+    <w:bookmarkStart w:id="47" w:name="decision-scenarios"/>
+    <w:p>
+      <w:pPr>
+        <w:pStyle w:val="TableCaption"/>
+      </w:pPr>
+      <w:r>
+        <w:t xml:space="preserve">Consequences of alternative post-hoc decision rules</w:t>
+      </w:r>
+    </w:p>
+    <w:tbl>
+      <w:tblPr>
+        <w:tblStyle w:val="Table"/>
+        <w:tblW w:type="pct" w:w="4878"/>
+        <w:tblLayout w:type="fixed"/>
+        <w:tblLook w:firstRow="1" w:lastRow="0" w:firstColumn="0" w:lastColumn="0" w:noHBand="0" w:noVBand="0" w:val="0020"/>
+        <w:tblCaption w:val="Consequences of alternative post-hoc decision rules"/>
+      </w:tblPr>
+      <w:tblGrid>
+        <w:gridCol w:w="4539"/>
+        <w:gridCol w:w="1062"/>
+        <w:gridCol w:w="1062"/>
+        <w:gridCol w:w="1062"/>
+      </w:tblGrid>
+      <w:tr>
+        <w:trPr>
+          <w:tblHeader w:val="on"/>
+        </w:trPr>
+        <w:tc>
+          <w:tcPr/>
+          <w:p>
+            <w:pPr>
+              <w:pStyle w:val="Compact"/>
+              <w:jc w:val="left"/>
+            </w:pPr>
+            <w:r>
+              <w:t xml:space="preserve">Decision rule</w:t>
+            </w:r>
+          </w:p>
+        </w:tc>
+        <w:tc>
+          <w:tcPr/>
+          <w:p>
+            <w:pPr>
+              <w:pStyle w:val="Compact"/>
+              <w:jc w:val="right"/>
+            </w:pPr>
+            <w:r>
+              <w:t xml:space="preserve">Excluded</w:t>
+            </w:r>
+          </w:p>
+        </w:tc>
+        <w:tc>
+          <w:tcPr/>
+          <w:p>
+            <w:pPr>
+              <w:pStyle w:val="Compact"/>
+              <w:jc w:val="right"/>
+            </w:pPr>
+            <w:r>
+              <w:t xml:space="preserve">%</w:t>
+            </w:r>
+            <w:r>
+              <w:t xml:space="preserve"> </w:t>
+            </w:r>
+            <w:r>
+              <w:t xml:space="preserve">excluded</w:t>
+            </w:r>
+          </w:p>
+        </w:tc>
+        <w:tc>
+          <w:tcPr/>
+          <w:p>
+            <w:pPr>
+              <w:pStyle w:val="Compact"/>
+              <w:jc w:val="right"/>
+            </w:pPr>
+            <w:r>
+              <w:t xml:space="preserve">Retained</w:t>
+            </w:r>
+          </w:p>
+        </w:tc>
+      </w:tr>
+      <w:tr>
+        <w:tc>
+          <w:tcPr/>
+          <w:p>
+            <w:pPr>
+              <w:pStyle w:val="Compact"/>
+              <w:jc w:val="left"/>
+            </w:pPr>
+            <w:r>
+              <w:t xml:space="preserve">Any of the five diagnostic flags</w:t>
+            </w:r>
+          </w:p>
+        </w:tc>
+        <w:tc>
+          <w:tcPr/>
+          <w:p>
+            <w:pPr>
+              <w:pStyle w:val="Compact"/>
+              <w:jc w:val="right"/>
+            </w:pPr>
+            <w:r>
+              <w:t xml:space="preserve">436</w:t>
+            </w:r>
+          </w:p>
+        </w:tc>
+        <w:tc>
+          <w:tcPr/>
+          <w:p>
+            <w:pPr>
+              <w:pStyle w:val="Compact"/>
+              <w:jc w:val="right"/>
+            </w:pPr>
+            <w:r>
+              <w:t xml:space="preserve">33.7</w:t>
+            </w:r>
+          </w:p>
+        </w:tc>
+        <w:tc>
+          <w:tcPr/>
+          <w:p>
+            <w:pPr>
+              <w:pStyle w:val="Compact"/>
+              <w:jc w:val="right"/>
+            </w:pPr>
+            <w:r>
+              <w:t xml:space="preserve">859</w:t>
+            </w:r>
+          </w:p>
+        </w:tc>
+      </w:tr>
+      <w:tr>
+        <w:tc>
+          <w:tcPr/>
+          <w:p>
+            <w:pPr>
+              <w:pStyle w:val="Compact"/>
+              <w:jc w:val="left"/>
+            </w:pPr>
+            <w:r>
+              <w:t xml:space="preserve">At least two of the five diagnostic flags</w:t>
+            </w:r>
+          </w:p>
+        </w:tc>
+        <w:tc>
+          <w:tcPr/>
+          <w:p>
+            <w:pPr>
+              <w:pStyle w:val="Compact"/>
+              <w:jc w:val="right"/>
+            </w:pPr>
+            <w:r>
+              <w:t xml:space="preserve">139</w:t>
+            </w:r>
+          </w:p>
+        </w:tc>
+        <w:tc>
+          <w:tcPr/>
+          <w:p>
+            <w:pPr>
+              <w:pStyle w:val="Compact"/>
+              <w:jc w:val="right"/>
+            </w:pPr>
+            <w:r>
+              <w:t xml:space="preserve">10.7</w:t>
+            </w:r>
+          </w:p>
+        </w:tc>
+        <w:tc>
+          <w:tcPr/>
+          <w:p>
+            <w:pPr>
+              <w:pStyle w:val="Compact"/>
+              <w:jc w:val="right"/>
+            </w:pPr>
+            <w:r>
+              <w:t xml:space="preserve">1156</w:t>
+            </w:r>
+          </w:p>
+        </w:tc>
+      </w:tr>
+      <w:tr>
+        <w:tc>
+          <w:tcPr/>
+          <w:p>
+            <w:pPr>
+              <w:pStyle w:val="Compact"/>
+              <w:jc w:val="left"/>
+            </w:pPr>
+            <w:r>
+              <w:t xml:space="preserve">Any of the four decision flags (excluding</w:t>
+            </w:r>
+            <w:r>
+              <w:t xml:space="preserve"> </w:t>
+            </w:r>
+            <w:r>
+              <w:t xml:space="preserve">Longstring)</w:t>
+            </w:r>
+          </w:p>
+        </w:tc>
+        <w:tc>
+          <w:tcPr/>
+          <w:p>
+            <w:pPr>
+              <w:pStyle w:val="Compact"/>
+              <w:jc w:val="right"/>
+            </w:pPr>
+            <w:r>
+              <w:t xml:space="preserve">344</w:t>
+            </w:r>
+          </w:p>
+        </w:tc>
+        <w:tc>
+          <w:tcPr/>
+          <w:p>
+            <w:pPr>
+              <w:pStyle w:val="Compact"/>
+              <w:jc w:val="right"/>
+            </w:pPr>
+            <w:r>
+              <w:t xml:space="preserve">26.6</w:t>
+            </w:r>
+          </w:p>
+        </w:tc>
+        <w:tc>
+          <w:tcPr/>
+          <w:p>
+            <w:pPr>
+              <w:pStyle w:val="Compact"/>
+              <w:jc w:val="right"/>
+            </w:pPr>
+            <w:r>
+              <w:t xml:space="preserve">951</w:t>
+            </w:r>
+          </w:p>
+        </w:tc>
+      </w:tr>
+      <w:tr>
+        <w:tc>
+          <w:tcPr/>
+          <w:p>
+            <w:pPr>
+              <w:pStyle w:val="Compact"/>
+              <w:jc w:val="left"/>
+            </w:pPr>
+            <w:r>
+              <w:t xml:space="preserve">At least two of the four decision flags (Plan</w:t>
+            </w:r>
+            <w:r>
+              <w:t xml:space="preserve"> </w:t>
+            </w:r>
+            <w:r>
+              <w:t xml:space="preserve">A)</w:t>
+            </w:r>
+          </w:p>
+        </w:tc>
+        <w:tc>
+          <w:tcPr/>
+          <w:p>
+            <w:pPr>
+              <w:pStyle w:val="Compact"/>
+              <w:jc w:val="right"/>
+            </w:pPr>
+            <w:r>
+              <w:t xml:space="preserve">62</w:t>
+            </w:r>
+          </w:p>
+        </w:tc>
+        <w:tc>
+          <w:tcPr/>
+          <w:p>
+            <w:pPr>
+              <w:pStyle w:val="Compact"/>
+              <w:jc w:val="right"/>
+            </w:pPr>
+            <w:r>
+              <w:t xml:space="preserve">4.8</w:t>
+            </w:r>
+          </w:p>
+        </w:tc>
+        <w:tc>
+          <w:tcPr/>
+          <w:p>
+            <w:pPr>
+              <w:pStyle w:val="Compact"/>
+              <w:jc w:val="right"/>
+            </w:pPr>
+            <w:r>
+              <w:t xml:space="preserve">1233</w:t>
+            </w:r>
+          </w:p>
+        </w:tc>
+      </w:tr>
+      <w:tr>
+        <w:tc>
+          <w:tcPr/>
+          <w:p>
+            <w:pPr>
+              <w:pStyle w:val="Compact"/>
+              <w:jc w:val="left"/>
+            </w:pPr>
+            <w:r>
+              <w:t xml:space="preserve">Laz.R or MD (case-review screening)</w:t>
+            </w:r>
+          </w:p>
+        </w:tc>
+        <w:tc>
+          <w:tcPr/>
+          <w:p>
+            <w:pPr>
+              <w:pStyle w:val="Compact"/>
+              <w:jc w:val="right"/>
+            </w:pPr>
+            <w:r>
+              <w:t xml:space="preserve">290</w:t>
+            </w:r>
+          </w:p>
+        </w:tc>
+        <w:tc>
+          <w:tcPr/>
+          <w:p>
+            <w:pPr>
+              <w:pStyle w:val="Compact"/>
+              <w:jc w:val="right"/>
+            </w:pPr>
+            <w:r>
+              <w:t xml:space="preserve">22.4</w:t>
+            </w:r>
+          </w:p>
+        </w:tc>
+        <w:tc>
+          <w:tcPr/>
+          <w:p>
+            <w:pPr>
+              <w:pStyle w:val="Compact"/>
+              <w:jc w:val="right"/>
+            </w:pPr>
+            <w:r>
+              <w:t xml:space="preserve">1005</w:t>
+            </w:r>
+          </w:p>
+        </w:tc>
+      </w:tr>
+      <w:tr>
+        <w:tc>
+          <w:tcPr/>
+          <w:p>
+            <w:pPr>
+              <w:pStyle w:val="Compact"/>
+              <w:jc w:val="left"/>
+            </w:pPr>
+            <w:r>
+              <w:t xml:space="preserve">Laz.R and MD</w:t>
+            </w:r>
+          </w:p>
+        </w:tc>
+        <w:tc>
+          <w:tcPr/>
+          <w:p>
+            <w:pPr>
+              <w:pStyle w:val="Compact"/>
+              <w:jc w:val="right"/>
+            </w:pPr>
+            <w:r>
+              <w:t xml:space="preserve">2</w:t>
+            </w:r>
+          </w:p>
+        </w:tc>
+        <w:tc>
+          <w:tcPr/>
+          <w:p>
+            <w:pPr>
+              <w:pStyle w:val="Compact"/>
+              <w:jc w:val="right"/>
+            </w:pPr>
+            <w:r>
+              <w:t xml:space="preserve">0.2</w:t>
+            </w:r>
+          </w:p>
+        </w:tc>
+        <w:tc>
+          <w:tcPr/>
+          <w:p>
+            <w:pPr>
+              <w:pStyle w:val="Compact"/>
+              <w:jc w:val="right"/>
+            </w:pPr>
+            <w:r>
+              <w:t xml:space="preserve">1293</w:t>
+            </w:r>
+          </w:p>
+        </w:tc>
+      </w:tr>
+    </w:tbl>
+    <w:bookmarkEnd w:id="47"/>
+    <w:p>
+      <w:pPr>
+        <w:pStyle w:val="BodyText"/>
+      </w:pPr>
+      <w:r>
+        <w:rPr>
+          <w:vertAlign w:val="subscript"/>
+        </w:rPr>
+        <w:t xml:space="preserve">Source:</w:t>
+      </w:r>
+      <w:r>
+        <w:rPr>
+          <w:vertAlign w:val="subscript"/>
+        </w:rPr>
+        <w:t xml:space="preserve"> </w:t>
+      </w:r>
+      <w:hyperlink r:id="rId48">
+        <w:r>
+          <w:rPr>
+            <w:rStyle w:val="Hyperlink"/>
+            <w:vertAlign w:val="subscript"/>
+          </w:rPr>
+          <w:t xml:space="preserve">Post-hoc C/IER Indicators</w:t>
+        </w:r>
+      </w:hyperlink>
+    </w:p>
+    <w:p>
+      <w:pPr>
+        <w:pStyle w:val="BodyText"/>
+      </w:pPr>
+    </w:p>
+    <w:p>
+      <w:pPr>
+        <w:pStyle w:val="BodyText"/>
+      </w:pPr>
+      <w:r>
+        <w:t xml:space="preserve">An OR rule across all five flags would remove 436 respondents (33.7%), leaving</w:t>
+      </w:r>
+      <w:r>
+        <w:t xml:space="preserve"> </w:t>
+      </w:r>
+      <w:r>
+        <w:t xml:space="preserve">859 observations. Even after removing Longstring from the decision set, an OR</w:t>
+      </w:r>
+      <w:r>
+        <w:t xml:space="preserve"> </w:t>
+      </w:r>
+      <w:r>
+        <w:t xml:space="preserve">rule would remove 344 respondents (26.6%). These reductions are difficult to</w:t>
+      </w:r>
+      <w:r>
+        <w:t xml:space="preserve"> </w:t>
+      </w:r>
+      <w:r>
+        <w:t xml:space="preserve">defend when a single post-hoc indicator can produce false positives. In</w:t>
+      </w:r>
+      <w:r>
+        <w:t xml:space="preserve"> </w:t>
+      </w:r>
+      <w:r>
+        <w:t xml:space="preserve">particular, Mahalanobis distance may overflag respondents when ordinal item</w:t>
+      </w:r>
+      <w:r>
+        <w:t xml:space="preserve"> </w:t>
+      </w:r>
+      <w:r>
+        <w:t xml:space="preserve">responses depart from the multivariate-normal assumptions used in conventional</w:t>
+      </w:r>
+      <w:r>
+        <w:t xml:space="preserve"> </w:t>
+      </w:r>
+      <w:r>
+        <w:t xml:space="preserve">outlier detection</w:t>
+      </w:r>
+      <w:r>
+        <w:t xml:space="preserve"> </w:t>
+      </w:r>
+      <w:r>
+        <w:t xml:space="preserve">(Hong et al., 2020)</w:t>
+      </w:r>
+      <w:r>
+        <w:t xml:space="preserve">.</w:t>
+      </w:r>
+    </w:p>
+    <w:bookmarkEnd w:id="49"/>
+    <w:bookmarkStart w:id="54" w:name="what-the-intersections-show"/>
+    <w:p>
+      <w:pPr>
+        <w:pStyle w:val="Heading4"/>
+      </w:pPr>
+      <w:r>
+        <w:t xml:space="preserve">4.5.2 What the intersections show</w:t>
+      </w:r>
+    </w:p>
+    <w:p>
+      <w:pPr>
+        <w:pStyle w:val="FirstParagraph"/>
+      </w:pPr>
+      <w:r>
+        <w:t xml:space="preserve">Longstring and low IRV are invariability-oriented diagnostics, high IRV targets</w:t>
+      </w:r>
+      <w:r>
+        <w:t xml:space="preserve"> </w:t>
+      </w:r>
+      <w:r>
+        <w:t xml:space="preserve">excessive variation, and MD targets multivariate atypicality. Laz.R detects</w:t>
+      </w:r>
+      <w:r>
+        <w:t xml:space="preserve"> </w:t>
+      </w:r>
+      <w:r>
+        <w:t xml:space="preserve">predictable transitions, including straightlining, alternating, and diagonal</w:t>
+      </w:r>
+      <w:r>
+        <w:t xml:space="preserve"> </w:t>
+      </w:r>
+      <w:r>
+        <w:t xml:space="preserve">patterns, but it is not a general detector of random responding. Laz.R should</w:t>
+      </w:r>
+      <w:r>
+        <w:t xml:space="preserve"> </w:t>
+      </w:r>
+      <w:r>
+        <w:t xml:space="preserve">therefore be combined with complementary approaches, and its Kneedle cut-off</w:t>
+      </w:r>
+      <w:r>
+        <w:t xml:space="preserve"> </w:t>
+      </w:r>
+      <w:r>
+        <w:t xml:space="preserve">should support scrutiny and possible exclusion rather than be treated as proof</w:t>
+      </w:r>
+      <w:r>
+        <w:t xml:space="preserve"> </w:t>
+      </w:r>
+      <w:r>
+        <w:t xml:space="preserve">of carelessness</w:t>
+      </w:r>
+      <w:r>
+        <w:t xml:space="preserve"> </w:t>
+      </w:r>
+      <w:r>
+        <w:t xml:space="preserve">(Biemann et al., 2025)</w:t>
+      </w:r>
+      <w:r>
+        <w:t xml:space="preserve">.</w:t>
+      </w:r>
+    </w:p>
+    <w:bookmarkStart w:id="50" w:name="flag-pairwise-overlap"/>
+    <w:p>
+      <w:pPr>
+        <w:pStyle w:val="TableCaption"/>
+      </w:pPr>
+      <w:r>
+        <w:t xml:space="preserve">Pairwise overlap among diagnostic C/IER flags</w:t>
+      </w:r>
+    </w:p>
+    <w:tbl>
+      <w:tblPr>
+        <w:tblStyle w:val="Table"/>
+        <w:tblW w:type="pct" w:w="4870"/>
+        <w:tblLayout w:type="fixed"/>
+        <w:tblLook w:firstRow="1" w:lastRow="0" w:firstColumn="0" w:lastColumn="0" w:noHBand="0" w:noVBand="0" w:val="0020"/>
+        <w:tblCaption w:val="Pairwise overlap among diagnostic C/IER flags"/>
+      </w:tblPr>
+      <w:tblGrid>
+        <w:gridCol w:w="1337"/>
+        <w:gridCol w:w="1337"/>
+        <w:gridCol w:w="1542"/>
+        <w:gridCol w:w="1748"/>
+        <w:gridCol w:w="1748"/>
+      </w:tblGrid>
+      <w:tr>
+        <w:trPr>
+          <w:tblHeader w:val="on"/>
+        </w:trPr>
+        <w:tc>
+          <w:tcPr/>
+          <w:p>
+            <w:pPr>
+              <w:pStyle w:val="Compact"/>
+              <w:jc w:val="left"/>
+            </w:pPr>
+            <w:r>
+              <w:t xml:space="preserve">Indicator 1</w:t>
+            </w:r>
+          </w:p>
+        </w:tc>
+        <w:tc>
+          <w:tcPr/>
+          <w:p>
+            <w:pPr>
+              <w:pStyle w:val="Compact"/>
+              <w:jc w:val="left"/>
+            </w:pPr>
+            <w:r>
+              <w:t xml:space="preserve">Indicator 2</w:t>
+            </w:r>
+          </w:p>
+        </w:tc>
+        <w:tc>
+          <w:tcPr/>
+          <w:p>
+            <w:pPr>
+              <w:pStyle w:val="Compact"/>
+            </w:pPr>
+            <w:r>
+              <w:t xml:space="preserve">N intersection</w:t>
+            </w:r>
+          </w:p>
+        </w:tc>
+        <w:tc>
+          <w:tcPr/>
+          <w:p>
+            <w:pPr>
+              <w:pStyle w:val="Compact"/>
+              <w:jc w:val="right"/>
+            </w:pPr>
+            <w:r>
+              <w:t xml:space="preserve">% of indicator</w:t>
+            </w:r>
+            <w:r>
+              <w:t xml:space="preserve"> </w:t>
+            </w:r>
+            <w:r>
+              <w:t xml:space="preserve">1</w:t>
+            </w:r>
+          </w:p>
+        </w:tc>
+        <w:tc>
+          <w:tcPr/>
+          <w:p>
+            <w:pPr>
+              <w:pStyle w:val="Compact"/>
+              <w:jc w:val="right"/>
+            </w:pPr>
+            <w:r>
+              <w:t xml:space="preserve">% of indicator</w:t>
+            </w:r>
+            <w:r>
+              <w:t xml:space="preserve"> </w:t>
+            </w:r>
+            <w:r>
+              <w:t xml:space="preserve">2</w:t>
+            </w:r>
+          </w:p>
+        </w:tc>
+      </w:tr>
+      <w:tr>
+        <w:tc>
+          <w:tcPr/>
+          <w:p>
+            <w:pPr>
+              <w:pStyle w:val="Compact"/>
+              <w:jc w:val="left"/>
+            </w:pPr>
+            <w:r>
+              <w:t xml:space="preserve">Laz.R</w:t>
+            </w:r>
+          </w:p>
+        </w:tc>
+        <w:tc>
+          <w:tcPr/>
+          <w:p>
+            <w:pPr>
+              <w:pStyle w:val="Compact"/>
+              <w:jc w:val="left"/>
+            </w:pPr>
+            <w:r>
+              <w:t xml:space="preserve">Longstring</w:t>
+            </w:r>
+          </w:p>
+        </w:tc>
+        <w:tc>
+          <w:tcPr/>
+          <w:p>
+            <w:pPr>
+              <w:pStyle w:val="Compact"/>
+            </w:pPr>
+            <w:r>
+              <w:t xml:space="preserve">76</w:t>
+            </w:r>
+          </w:p>
+        </w:tc>
+        <w:tc>
+          <w:tcPr/>
+          <w:p>
+            <w:pPr>
+              <w:pStyle w:val="Compact"/>
+              <w:jc w:val="right"/>
+            </w:pPr>
+            <w:r>
+              <w:t xml:space="preserve">83.5</w:t>
+            </w:r>
+          </w:p>
+        </w:tc>
+        <w:tc>
+          <w:tcPr/>
+          <w:p>
+            <w:pPr>
+              <w:pStyle w:val="Compact"/>
+              <w:jc w:val="right"/>
+            </w:pPr>
+            <w:r>
+              <w:t xml:space="preserve">39.8</w:t>
+            </w:r>
+          </w:p>
+        </w:tc>
+      </w:tr>
+      <w:tr>
+        <w:tc>
+          <w:tcPr/>
+          <w:p>
+            <w:pPr>
+              <w:pStyle w:val="Compact"/>
+              <w:jc w:val="left"/>
+            </w:pPr>
+            <w:r>
+              <w:t xml:space="preserve">Laz.R</w:t>
+            </w:r>
+          </w:p>
+        </w:tc>
+        <w:tc>
+          <w:tcPr/>
+          <w:p>
+            <w:pPr>
+              <w:pStyle w:val="Compact"/>
+              <w:jc w:val="left"/>
+            </w:pPr>
+            <w:r>
+              <w:t xml:space="preserve">MD</w:t>
+            </w:r>
+          </w:p>
+        </w:tc>
+        <w:tc>
+          <w:tcPr/>
+          <w:p>
+            <w:pPr>
+              <w:pStyle w:val="Compact"/>
+            </w:pPr>
+            <w:r>
+              <w:t xml:space="preserve">2</w:t>
+            </w:r>
+          </w:p>
+        </w:tc>
+        <w:tc>
+          <w:tcPr/>
+          <w:p>
+            <w:pPr>
+              <w:pStyle w:val="Compact"/>
+              <w:jc w:val="right"/>
+            </w:pPr>
+            <w:r>
+              <w:t xml:space="preserve">2.2</w:t>
+            </w:r>
+          </w:p>
+        </w:tc>
+        <w:tc>
+          <w:tcPr/>
+          <w:p>
+            <w:pPr>
+              <w:pStyle w:val="Compact"/>
+              <w:jc w:val="right"/>
+            </w:pPr>
+            <w:r>
+              <w:t xml:space="preserve">1.0</w:t>
+            </w:r>
+          </w:p>
+        </w:tc>
+      </w:tr>
+      <w:tr>
+        <w:tc>
+          <w:tcPr/>
+          <w:p>
+            <w:pPr>
+              <w:pStyle w:val="Compact"/>
+              <w:jc w:val="left"/>
+            </w:pPr>
+            <w:r>
+              <w:t xml:space="preserve">Laz.R</w:t>
+            </w:r>
+          </w:p>
+        </w:tc>
+        <w:tc>
+          <w:tcPr/>
+          <w:p>
+            <w:pPr>
+              <w:pStyle w:val="Compact"/>
+              <w:jc w:val="left"/>
+            </w:pPr>
+            <w:r>
+              <w:t xml:space="preserve">IRV high</w:t>
+            </w:r>
+          </w:p>
+        </w:tc>
+        <w:tc>
+          <w:tcPr/>
+          <w:p>
+            <w:pPr>
+              <w:pStyle w:val="Compact"/>
+            </w:pPr>
+            <w:r>
+              <w:t xml:space="preserve">2</w:t>
+            </w:r>
+          </w:p>
+        </w:tc>
+        <w:tc>
+          <w:tcPr/>
+          <w:p>
+            <w:pPr>
+              <w:pStyle w:val="Compact"/>
+              <w:jc w:val="right"/>
+            </w:pPr>
+            <w:r>
+              <w:t xml:space="preserve">2.2</w:t>
+            </w:r>
+          </w:p>
+        </w:tc>
+        <w:tc>
+          <w:tcPr/>
+          <w:p>
+            <w:pPr>
+              <w:pStyle w:val="Compact"/>
+              <w:jc w:val="right"/>
+            </w:pPr>
+            <w:r>
+              <w:t xml:space="preserve">3.0</w:t>
+            </w:r>
+          </w:p>
+        </w:tc>
+      </w:tr>
+      <w:tr>
+        <w:tc>
+          <w:tcPr/>
+          <w:p>
+            <w:pPr>
+              <w:pStyle w:val="Compact"/>
+              <w:jc w:val="left"/>
+            </w:pPr>
+            <w:r>
+              <w:t xml:space="preserve">Laz.R</w:t>
+            </w:r>
+          </w:p>
+        </w:tc>
+        <w:tc>
+          <w:tcPr/>
+          <w:p>
+            <w:pPr>
+              <w:pStyle w:val="Compact"/>
+              <w:jc w:val="left"/>
+            </w:pPr>
+            <w:r>
+              <w:t xml:space="preserve">IRV low</w:t>
+            </w:r>
+          </w:p>
+        </w:tc>
+        <w:tc>
+          <w:tcPr/>
+          <w:p>
+            <w:pPr>
+              <w:pStyle w:val="Compact"/>
+            </w:pPr>
+            <w:r>
+              <w:t xml:space="preserve">18</w:t>
+            </w:r>
+          </w:p>
+        </w:tc>
+        <w:tc>
+          <w:tcPr/>
+          <w:p>
+            <w:pPr>
+              <w:pStyle w:val="Compact"/>
+              <w:jc w:val="right"/>
+            </w:pPr>
+            <w:r>
+              <w:t xml:space="preserve">19.8</w:t>
+            </w:r>
+          </w:p>
+        </w:tc>
+        <w:tc>
+          <w:tcPr/>
+          <w:p>
+            <w:pPr>
+              <w:pStyle w:val="Compact"/>
+              <w:jc w:val="right"/>
+            </w:pPr>
+            <w:r>
+              <w:t xml:space="preserve">36.7</w:t>
+            </w:r>
+          </w:p>
+        </w:tc>
+      </w:tr>
+      <w:tr>
+        <w:tc>
+          <w:tcPr/>
+          <w:p>
+            <w:pPr>
+              <w:pStyle w:val="Compact"/>
+              <w:jc w:val="left"/>
+            </w:pPr>
+            <w:r>
+              <w:t xml:space="preserve">Longstring</w:t>
+            </w:r>
+          </w:p>
+        </w:tc>
+        <w:tc>
+          <w:tcPr/>
+          <w:p>
+            <w:pPr>
+              <w:pStyle w:val="Compact"/>
+              <w:jc w:val="left"/>
+            </w:pPr>
+            <w:r>
+              <w:t xml:space="preserve">MD</w:t>
+            </w:r>
+          </w:p>
+        </w:tc>
+        <w:tc>
+          <w:tcPr/>
+          <w:p>
+            <w:pPr>
+              <w:pStyle w:val="Compact"/>
+            </w:pPr>
+            <w:r>
+              <w:t xml:space="preserve">8</w:t>
+            </w:r>
+          </w:p>
+        </w:tc>
+        <w:tc>
+          <w:tcPr/>
+          <w:p>
+            <w:pPr>
+              <w:pStyle w:val="Compact"/>
+              <w:jc w:val="right"/>
+            </w:pPr>
+            <w:r>
+              <w:t xml:space="preserve">4.2</w:t>
+            </w:r>
+          </w:p>
+        </w:tc>
+        <w:tc>
+          <w:tcPr/>
+          <w:p>
+            <w:pPr>
+              <w:pStyle w:val="Compact"/>
+              <w:jc w:val="right"/>
+            </w:pPr>
+            <w:r>
+              <w:t xml:space="preserve">4.0</w:t>
+            </w:r>
+          </w:p>
+        </w:tc>
+      </w:tr>
+      <w:tr>
+        <w:tc>
+          <w:tcPr/>
+          <w:p>
+            <w:pPr>
+              <w:pStyle w:val="Compact"/>
+              <w:jc w:val="left"/>
+            </w:pPr>
+            <w:r>
+              <w:t xml:space="preserve">Longstring</w:t>
+            </w:r>
+          </w:p>
+        </w:tc>
+        <w:tc>
+          <w:tcPr/>
+          <w:p>
+            <w:pPr>
+              <w:pStyle w:val="Compact"/>
+              <w:jc w:val="left"/>
+            </w:pPr>
+            <w:r>
+              <w:t xml:space="preserve">IRV high</w:t>
+            </w:r>
+          </w:p>
+        </w:tc>
+        <w:tc>
+          <w:tcPr/>
+          <w:p>
+            <w:pPr>
+              <w:pStyle w:val="Compact"/>
+            </w:pPr>
+            <w:r>
+              <w:t xml:space="preserve">11</w:t>
+            </w:r>
+          </w:p>
+        </w:tc>
+        <w:tc>
+          <w:tcPr/>
+          <w:p>
+            <w:pPr>
+              <w:pStyle w:val="Compact"/>
+              <w:jc w:val="right"/>
+            </w:pPr>
+            <w:r>
+              <w:t xml:space="preserve">5.8</w:t>
+            </w:r>
+          </w:p>
+        </w:tc>
+        <w:tc>
+          <w:tcPr/>
+          <w:p>
+            <w:pPr>
+              <w:pStyle w:val="Compact"/>
+              <w:jc w:val="right"/>
+            </w:pPr>
+            <w:r>
+              <w:t xml:space="preserve">16.7</w:t>
+            </w:r>
+          </w:p>
+        </w:tc>
+      </w:tr>
+      <w:tr>
+        <w:tc>
+          <w:tcPr/>
+          <w:p>
+            <w:pPr>
+              <w:pStyle w:val="Compact"/>
+              <w:jc w:val="left"/>
+            </w:pPr>
+            <w:r>
+              <w:t xml:space="preserve">Longstring</w:t>
+            </w:r>
+          </w:p>
+        </w:tc>
+        <w:tc>
+          <w:tcPr/>
+          <w:p>
+            <w:pPr>
+              <w:pStyle w:val="Compact"/>
+              <w:jc w:val="left"/>
+            </w:pPr>
+            <w:r>
+              <w:t xml:space="preserve">IRV low</w:t>
+            </w:r>
+          </w:p>
+        </w:tc>
+        <w:tc>
+          <w:tcPr/>
+          <w:p>
+            <w:pPr>
+              <w:pStyle w:val="Compact"/>
+            </w:pPr>
+            <w:r>
+              <w:t xml:space="preserve">26</w:t>
+            </w:r>
+          </w:p>
+        </w:tc>
+        <w:tc>
+          <w:tcPr/>
+          <w:p>
+            <w:pPr>
+              <w:pStyle w:val="Compact"/>
+              <w:jc w:val="right"/>
+            </w:pPr>
+            <w:r>
+              <w:t xml:space="preserve">13.6</w:t>
+            </w:r>
+          </w:p>
+        </w:tc>
+        <w:tc>
+          <w:tcPr/>
+          <w:p>
+            <w:pPr>
+              <w:pStyle w:val="Compact"/>
+              <w:jc w:val="right"/>
+            </w:pPr>
+            <w:r>
+              <w:t xml:space="preserve">53.1</w:t>
+            </w:r>
+          </w:p>
+        </w:tc>
+      </w:tr>
+      <w:tr>
+        <w:tc>
+          <w:tcPr/>
+          <w:p>
+            <w:pPr>
+              <w:pStyle w:val="Compact"/>
+              <w:jc w:val="left"/>
+            </w:pPr>
+            <w:r>
+              <w:t xml:space="preserve">MD</w:t>
+            </w:r>
+          </w:p>
+        </w:tc>
+        <w:tc>
+          <w:tcPr/>
+          <w:p>
+            <w:pPr>
+              <w:pStyle w:val="Compact"/>
+              <w:jc w:val="left"/>
+            </w:pPr>
+            <w:r>
+              <w:t xml:space="preserve">IRV high</w:t>
+            </w:r>
+          </w:p>
+        </w:tc>
+        <w:tc>
+          <w:tcPr/>
+          <w:p>
+            <w:pPr>
+              <w:pStyle w:val="Compact"/>
+            </w:pPr>
+            <w:r>
+              <w:t xml:space="preserve">42</w:t>
+            </w:r>
+          </w:p>
+        </w:tc>
+        <w:tc>
+          <w:tcPr/>
+          <w:p>
+            <w:pPr>
+              <w:pStyle w:val="Compact"/>
+              <w:jc w:val="right"/>
+            </w:pPr>
+            <w:r>
+              <w:t xml:space="preserve">20.9</w:t>
+            </w:r>
+          </w:p>
+        </w:tc>
+        <w:tc>
+          <w:tcPr/>
+          <w:p>
+            <w:pPr>
+              <w:pStyle w:val="Compact"/>
+              <w:jc w:val="right"/>
+            </w:pPr>
+            <w:r>
+              <w:t xml:space="preserve">63.6</w:t>
+            </w:r>
+          </w:p>
+        </w:tc>
+      </w:tr>
+      <w:tr>
+        <w:tc>
+          <w:tcPr/>
+          <w:p>
+            <w:pPr>
+              <w:pStyle w:val="Compact"/>
+              <w:jc w:val="left"/>
+            </w:pPr>
+            <w:r>
+              <w:t xml:space="preserve">MD</w:t>
+            </w:r>
+          </w:p>
+        </w:tc>
+        <w:tc>
+          <w:tcPr/>
+          <w:p>
+            <w:pPr>
+              <w:pStyle w:val="Compact"/>
+              <w:jc w:val="left"/>
+            </w:pPr>
+            <w:r>
+              <w:t xml:space="preserve">IRV low</w:t>
+            </w:r>
+          </w:p>
+        </w:tc>
+        <w:tc>
+          <w:tcPr/>
+          <w:p>
+            <w:pPr>
+              <w:pStyle w:val="Compact"/>
+            </w:pPr>
+            <w:r>
+              <w:t xml:space="preserve">0</w:t>
+            </w:r>
+          </w:p>
+        </w:tc>
+        <w:tc>
+          <w:tcPr/>
+          <w:p>
+            <w:pPr>
+              <w:pStyle w:val="Compact"/>
+              <w:jc w:val="right"/>
+            </w:pPr>
+            <w:r>
+              <w:t xml:space="preserve">0.0</w:t>
+            </w:r>
+          </w:p>
+        </w:tc>
+        <w:tc>
+          <w:tcPr/>
+          <w:p>
+            <w:pPr>
+              <w:pStyle w:val="Compact"/>
+              <w:jc w:val="right"/>
+            </w:pPr>
+            <w:r>
+              <w:t xml:space="preserve">0.0</w:t>
+            </w:r>
+          </w:p>
+        </w:tc>
+      </w:tr>
+      <w:tr>
+        <w:tc>
+          <w:tcPr/>
+          <w:p>
+            <w:pPr>
+              <w:pStyle w:val="Compact"/>
+              <w:jc w:val="left"/>
+            </w:pPr>
+            <w:r>
+              <w:t xml:space="preserve">IRV high</w:t>
+            </w:r>
+          </w:p>
+        </w:tc>
+        <w:tc>
+          <w:tcPr/>
+          <w:p>
+            <w:pPr>
+              <w:pStyle w:val="Compact"/>
+              <w:jc w:val="left"/>
+            </w:pPr>
+            <w:r>
+              <w:t xml:space="preserve">IRV low</w:t>
+            </w:r>
+          </w:p>
+        </w:tc>
+        <w:tc>
+          <w:tcPr/>
+          <w:p>
+            <w:pPr>
+              <w:pStyle w:val="Compact"/>
+            </w:pPr>
+            <w:r>
+              <w:t xml:space="preserve">0</w:t>
+            </w:r>
+          </w:p>
+        </w:tc>
+        <w:tc>
+          <w:tcPr/>
+          <w:p>
+            <w:pPr>
+              <w:pStyle w:val="Compact"/>
+              <w:jc w:val="right"/>
+            </w:pPr>
+            <w:r>
+              <w:t xml:space="preserve">0.0</w:t>
+            </w:r>
+          </w:p>
+        </w:tc>
+        <w:tc>
+          <w:tcPr/>
+          <w:p>
+            <w:pPr>
+              <w:pStyle w:val="Compact"/>
+              <w:jc w:val="right"/>
+            </w:pPr>
+            <w:r>
+              <w:t xml:space="preserve">0.0</w:t>
+            </w:r>
+          </w:p>
+        </w:tc>
+      </w:tr>
+    </w:tbl>
+    <w:bookmarkEnd w:id="50"/>
+    <w:p>
+      <w:pPr>
+        <w:pStyle w:val="BodyText"/>
+      </w:pPr>
+      <w:r>
+        <w:rPr>
+          <w:vertAlign w:val="subscript"/>
+        </w:rPr>
+        <w:t xml:space="preserve">Source:</w:t>
+      </w:r>
+      <w:r>
+        <w:rPr>
+          <w:vertAlign w:val="subscript"/>
+        </w:rPr>
+        <w:t xml:space="preserve"> </w:t>
+      </w:r>
+      <w:hyperlink r:id="rId51">
+        <w:r>
+          <w:rPr>
+            <w:rStyle w:val="Hyperlink"/>
+            <w:vertAlign w:val="subscript"/>
+          </w:rPr>
+          <w:t xml:space="preserve">Post-hoc C/IER Indicators</w:t>
+        </w:r>
+      </w:hyperlink>
+    </w:p>
+    <w:p>
+      <w:pPr>
+        <w:pStyle w:val="BodyText"/>
+      </w:pPr>
+    </w:p>
+    <w:p>
+      <w:pPr>
+        <w:pStyle w:val="BodyText"/>
+      </w:pPr>
+      <w:r>
+        <w:t xml:space="preserve">Of the 91 Laz.R flags, 76 (83.5%) are also Longstring flags. Counting both in</w:t>
+      </w:r>
+      <w:r>
+        <w:t xml:space="preserve"> </w:t>
+      </w:r>
+      <w:r>
+        <w:t xml:space="preserve">the composite rule would allow one narrow manifestation - repetitive or highly</w:t>
+      </w:r>
+      <w:r>
+        <w:t xml:space="preserve"> </w:t>
+      </w:r>
+      <w:r>
+        <w:t xml:space="preserve">predictable responding - to contribute two votes. Longstring remains useful</w:t>
+      </w:r>
+      <w:r>
+        <w:t xml:space="preserve"> </w:t>
+      </w:r>
+      <w:r>
+        <w:t xml:space="preserve">for diagnosis and teaching, but its narrower scope and empirical redundancy</w:t>
+      </w:r>
+      <w:r>
+        <w:t xml:space="preserve"> </w:t>
+      </w:r>
+      <w:r>
+        <w:t xml:space="preserve">with Laz.R justify excluding it from the final flag count. Conversely, 42 of</w:t>
+      </w:r>
+      <w:r>
+        <w:t xml:space="preserve"> </w:t>
+      </w:r>
+      <w:r>
+        <w:t xml:space="preserve">the 66 IRV-high cases are also flagged by MD, providing convergent evidence for</w:t>
+      </w:r>
+      <w:r>
+        <w:t xml:space="preserve"> </w:t>
+      </w:r>
+      <w:r>
+        <w:t xml:space="preserve">excessive variability or multivariate atypicality.</w:t>
+      </w:r>
+    </w:p>
+    <w:bookmarkStart w:id="52" w:name="lazr-md-intersection"/>
+    <w:p>
+      <w:pPr>
+        <w:pStyle w:val="TableCaption"/>
+      </w:pPr>
+      <w:r>
+        <w:t xml:space="preserve">Intersection of Laz.R and Mahalanobis distance flags</w:t>
+      </w:r>
+    </w:p>
+    <w:tbl>
+      <w:tblPr>
+        <w:tblStyle w:val="Table"/>
+        <w:tblW w:type="auto" w:w="0"/>
+        <w:tblLook w:firstRow="1" w:lastRow="0" w:firstColumn="0" w:lastColumn="0" w:noHBand="0" w:noVBand="0" w:val="0020"/>
+        <w:tblCaption w:val="Intersection of Laz.R and Mahalanobis distance flags"/>
+      </w:tblPr>
+      <w:tblGrid>
+        <w:gridCol w:w="2640"/>
+        <w:gridCol w:w="2640"/>
+        <w:gridCol w:w="2640"/>
+      </w:tblGrid>
+      <w:tr>
+        <w:trPr>
+          <w:tblHeader w:val="on"/>
+        </w:trPr>
+        <w:tc>
+          <w:tcPr/>
+          <w:p>
+            <w:pPr>
+              <w:pStyle w:val="Compact"/>
+              <w:jc w:val="left"/>
+            </w:pPr>
+            <w:r>
+              <w:t xml:space="preserve">Classification</w:t>
+            </w:r>
+          </w:p>
+        </w:tc>
+        <w:tc>
+          <w:tcPr/>
+          <w:p>
+            <w:pPr>
+              <w:pStyle w:val="Compact"/>
+              <w:jc w:val="right"/>
+            </w:pPr>
+            <w:r>
+              <w:t xml:space="preserve">N</w:t>
+            </w:r>
+          </w:p>
+        </w:tc>
+        <w:tc>
+          <w:tcPr/>
+          <w:p>
+            <w:pPr>
+              <w:pStyle w:val="Compact"/>
+              <w:jc w:val="right"/>
+            </w:pPr>
+            <w:r>
+              <w:t xml:space="preserve">% of sample</w:t>
+            </w:r>
+          </w:p>
+        </w:tc>
+      </w:tr>
+      <w:tr>
+        <w:tc>
+          <w:tcPr/>
+          <w:p>
+            <w:pPr>
+              <w:pStyle w:val="Compact"/>
+              <w:jc w:val="left"/>
+            </w:pPr>
+            <w:r>
+              <w:t xml:space="preserve">Neither flag</w:t>
+            </w:r>
+          </w:p>
+        </w:tc>
+        <w:tc>
+          <w:tcPr/>
+          <w:p>
+            <w:pPr>
+              <w:pStyle w:val="Compact"/>
+              <w:jc w:val="right"/>
+            </w:pPr>
+            <w:r>
+              <w:t xml:space="preserve">1005</w:t>
+            </w:r>
+          </w:p>
+        </w:tc>
+        <w:tc>
+          <w:tcPr/>
+          <w:p>
+            <w:pPr>
+              <w:pStyle w:val="Compact"/>
+              <w:jc w:val="right"/>
+            </w:pPr>
+            <w:r>
+              <w:t xml:space="preserve">77.6</w:t>
+            </w:r>
+          </w:p>
+        </w:tc>
+      </w:tr>
+      <w:tr>
+        <w:tc>
+          <w:tcPr/>
+          <w:p>
+            <w:pPr>
+              <w:pStyle w:val="Compact"/>
+              <w:jc w:val="left"/>
+            </w:pPr>
+            <w:r>
+              <w:t xml:space="preserve">MD only</w:t>
+            </w:r>
+          </w:p>
+        </w:tc>
+        <w:tc>
+          <w:tcPr/>
+          <w:p>
+            <w:pPr>
+              <w:pStyle w:val="Compact"/>
+              <w:jc w:val="right"/>
+            </w:pPr>
+            <w:r>
+              <w:t xml:space="preserve">199</w:t>
+            </w:r>
+          </w:p>
+        </w:tc>
+        <w:tc>
+          <w:tcPr/>
+          <w:p>
+            <w:pPr>
+              <w:pStyle w:val="Compact"/>
+              <w:jc w:val="right"/>
+            </w:pPr>
+            <w:r>
+              <w:t xml:space="preserve">15.4</w:t>
+            </w:r>
+          </w:p>
+        </w:tc>
+      </w:tr>
+      <w:tr>
+        <w:tc>
+          <w:tcPr/>
+          <w:p>
+            <w:pPr>
+              <w:pStyle w:val="Compact"/>
+              <w:jc w:val="left"/>
+            </w:pPr>
+            <w:r>
+              <w:t xml:space="preserve">Laz.R only</w:t>
+            </w:r>
+          </w:p>
+        </w:tc>
+        <w:tc>
+          <w:tcPr/>
+          <w:p>
+            <w:pPr>
+              <w:pStyle w:val="Compact"/>
+              <w:jc w:val="right"/>
+            </w:pPr>
+            <w:r>
+              <w:t xml:space="preserve">89</w:t>
+            </w:r>
+          </w:p>
+        </w:tc>
+        <w:tc>
+          <w:tcPr/>
+          <w:p>
+            <w:pPr>
+              <w:pStyle w:val="Compact"/>
+              <w:jc w:val="right"/>
+            </w:pPr>
+            <w:r>
+              <w:t xml:space="preserve">6.9</w:t>
+            </w:r>
+          </w:p>
+        </w:tc>
+      </w:tr>
+      <w:tr>
+        <w:tc>
+          <w:tcPr/>
+          <w:p>
+            <w:pPr>
+              <w:pStyle w:val="Compact"/>
+              <w:jc w:val="left"/>
+            </w:pPr>
+            <w:r>
+              <w:t xml:space="preserve">Both Laz.R and MD</w:t>
+            </w:r>
+          </w:p>
+        </w:tc>
+        <w:tc>
+          <w:tcPr/>
+          <w:p>
+            <w:pPr>
+              <w:pStyle w:val="Compact"/>
+              <w:jc w:val="right"/>
+            </w:pPr>
+            <w:r>
+              <w:t xml:space="preserve">2</w:t>
+            </w:r>
+          </w:p>
+        </w:tc>
+        <w:tc>
+          <w:tcPr/>
+          <w:p>
+            <w:pPr>
+              <w:pStyle w:val="Compact"/>
+              <w:jc w:val="right"/>
+            </w:pPr>
+            <w:r>
+              <w:t xml:space="preserve">0.2</w:t>
+            </w:r>
+          </w:p>
+        </w:tc>
+      </w:tr>
+    </w:tbl>
+    <w:bookmarkEnd w:id="52"/>
+    <w:p>
+      <w:pPr>
+        <w:pStyle w:val="BodyText"/>
+      </w:pPr>
+      <w:r>
+        <w:rPr>
+          <w:vertAlign w:val="subscript"/>
+        </w:rPr>
+        <w:t xml:space="preserve">Source:</w:t>
+      </w:r>
+      <w:r>
+        <w:rPr>
+          <w:vertAlign w:val="subscript"/>
+        </w:rPr>
+        <w:t xml:space="preserve"> </w:t>
+      </w:r>
+      <w:hyperlink r:id="rId53">
+        <w:r>
+          <w:rPr>
+            <w:rStyle w:val="Hyperlink"/>
+            <w:vertAlign w:val="subscript"/>
+          </w:rPr>
+          <w:t xml:space="preserve">Post-hoc C/IER Indicators</w:t>
+        </w:r>
+      </w:hyperlink>
+    </w:p>
+    <w:p>
+      <w:pPr>
+        <w:pStyle w:val="BodyText"/>
+      </w:pPr>
+    </w:p>
+    <w:p>
+      <w:pPr>
+        <w:pStyle w:val="BodyText"/>
+      </w:pPr>
+      <w:r>
+        <w:t xml:space="preserve">Only two respondents fail both Laz.R and MD, whereas 199 fail MD only and 89</w:t>
+      </w:r>
+      <w:r>
+        <w:t xml:space="preserve"> </w:t>
+      </w:r>
+      <w:r>
+        <w:t xml:space="preserve">fail Laz.R only. Requiring both would remove almost no cases, while using either</w:t>
+      </w:r>
+      <w:r>
+        <w:t xml:space="preserve"> </w:t>
+      </w:r>
+      <w:r>
+        <w:t xml:space="preserve">would identify 290 cases (22.4%) for case-by-case review. This can be a useful</w:t>
+      </w:r>
+      <w:r>
+        <w:t xml:space="preserve"> </w:t>
+      </w:r>
+      <w:r>
+        <w:t xml:space="preserve">screening pool, but it was not adopted as an automatic exclusion rule because</w:t>
+      </w:r>
+      <w:r>
+        <w:t xml:space="preserve"> </w:t>
+      </w:r>
+      <w:r>
+        <w:t xml:space="preserve">the indicators are nearly disjoint in this sample and MD-only evidence is not</w:t>
+      </w:r>
+      <w:r>
+        <w:t xml:space="preserve"> </w:t>
+      </w:r>
+      <w:r>
+        <w:t xml:space="preserve">sufficient to infer carelessness from ordinal responses</w:t>
+      </w:r>
+      <w:r>
+        <w:t xml:space="preserve"> </w:t>
+      </w:r>
+      <w:r>
+        <w:t xml:space="preserve">(Hong et al., 2020; Ward &amp; Meade, 2023)</w:t>
+      </w:r>
+      <w:r>
+        <w:t xml:space="preserve">.</w:t>
+      </w:r>
+    </w:p>
+    <w:bookmarkEnd w:id="54"/>
+    <w:bookmarkStart w:id="57" w:name="X36b84422d9f660eab4ba91b2be4044ba947450f"/>
+    <w:p>
+      <w:pPr>
+        <w:pStyle w:val="Heading4"/>
+      </w:pPr>
+      <w:r>
+        <w:t xml:space="preserve">4.5.3 Final rule: at least two of four decision flags</w:t>
+      </w:r>
+    </w:p>
+    <w:p>
+      <w:pPr>
+        <w:pStyle w:val="FirstParagraph"/>
+      </w:pPr>
+      <w:r>
+        <w:t xml:space="preserve">The final rule counts</w:t>
+      </w:r>
+      <w:r>
+        <w:t xml:space="preserve"> </w:t>
+      </w:r>
+      <w:r>
+        <w:rPr>
+          <w:b/>
+          <w:bCs/>
+        </w:rPr>
+        <w:t xml:space="preserve">Laz.R, MD, IRV high, and IRV low</w:t>
+      </w:r>
+      <w:r>
+        <w:t xml:space="preserve"> </w:t>
+      </w:r>
+      <w:r>
+        <w:t xml:space="preserve">and excludes a</w:t>
+      </w:r>
+      <w:r>
+        <w:t xml:space="preserve"> </w:t>
+      </w:r>
+      <w:r>
+        <w:t xml:space="preserve">respondent only when at least two of these four flags are present. It requires</w:t>
+      </w:r>
+      <w:r>
+        <w:t xml:space="preserve"> </w:t>
+      </w:r>
+      <w:r>
+        <w:t xml:space="preserve">corroboration, avoids deletion based on MD alone, and retains IRV as evidence</w:t>
+      </w:r>
+      <w:r>
+        <w:t xml:space="preserve"> </w:t>
+      </w:r>
+      <w:r>
+        <w:t xml:space="preserve">for both insufficient and excessive within-person variability. This follows</w:t>
+      </w:r>
+      <w:r>
+        <w:t xml:space="preserve"> </w:t>
+      </w:r>
+      <w:r>
+        <w:t xml:space="preserve">the recommendation to use multiple, context-appropriate indicators rather</w:t>
+      </w:r>
+      <w:r>
+        <w:t xml:space="preserve"> </w:t>
+      </w:r>
+      <w:r>
+        <w:t xml:space="preserve">than rely blindly on one index</w:t>
+      </w:r>
+      <w:r>
+        <w:t xml:space="preserve"> </w:t>
+      </w:r>
+      <w:r>
+        <w:t xml:space="preserve">(Curran, 2016; Ward &amp; Meade, 2023)</w:t>
+      </w:r>
+      <w:r>
+        <w:t xml:space="preserve">.</w:t>
+      </w:r>
+    </w:p>
+    <w:p>
+      <w:pPr>
+        <w:pStyle w:val="BodyText"/>
+      </w:pPr>
+      <w:r>
+        <w:t xml:space="preserve">Hong et al. (2020)</w:t>
+      </w:r>
+      <w:r>
+        <w:t xml:space="preserve"> </w:t>
+      </w:r>
+      <w:r>
+        <w:t xml:space="preserve">best-subset simulations support selecting a smaller group of</w:t>
+      </w:r>
+      <w:r>
+        <w:t xml:space="preserve"> </w:t>
+      </w:r>
+      <w:r>
+        <w:t xml:space="preserve">complementary indicators instead of a kitchen-sink combination, although their</w:t>
+      </w:r>
+      <w:r>
+        <w:t xml:space="preserve"> </w:t>
+      </w:r>
+      <w:r>
+        <w:t xml:space="preserve">specific subset and cut-offs are design-dependent and should not be imported</w:t>
+      </w:r>
+      <w:r>
+        <w:t xml:space="preserve"> </w:t>
+      </w:r>
+      <w:r>
+        <w:t xml:space="preserve">unchanged into the WHOQOL-Bref</w:t>
+      </w:r>
+      <w:r>
+        <w:t xml:space="preserve"> </w:t>
+      </w:r>
+      <w:r>
+        <w:t xml:space="preserve">(Hong et al., 2020)</w:t>
+      </w:r>
+      <w:r>
+        <w:t xml:space="preserve">. Plan A is therefore a transparent</w:t>
+      </w:r>
+      <w:r>
+        <w:t xml:space="preserve"> </w:t>
+      </w:r>
+      <w:r>
+        <w:t xml:space="preserve">teaching decision for this dataset, not a universal threshold.</w:t>
+      </w:r>
+    </w:p>
+    <w:bookmarkStart w:id="55" w:name="final-posthoc-rule"/>
+    <w:p>
+      <w:pPr>
+        <w:pStyle w:val="TableCaption"/>
+      </w:pPr>
+      <w:r>
+        <w:t xml:space="preserve">Evidence combinations among respondents excluded by Plan A</w:t>
+      </w:r>
+    </w:p>
+    <w:tbl>
+      <w:tblPr>
+        <w:tblStyle w:val="Table"/>
+        <w:tblW w:type="auto" w:w="0"/>
+        <w:tblLook w:firstRow="1" w:lastRow="0" w:firstColumn="0" w:lastColumn="0" w:noHBand="0" w:noVBand="0" w:val="0020"/>
+        <w:tblCaption w:val="Evidence combinations among respondents excluded by Plan A"/>
+      </w:tblPr>
+      <w:tblGrid>
+        <w:gridCol w:w="2640"/>
+        <w:gridCol w:w="2640"/>
+        <w:gridCol w:w="2640"/>
+      </w:tblGrid>
+      <w:tr>
+        <w:trPr>
+          <w:tblHeader w:val="on"/>
+        </w:trPr>
+        <w:tc>
+          <w:tcPr/>
+          <w:p>
+            <w:pPr>
+              <w:pStyle w:val="Compact"/>
+              <w:jc w:val="left"/>
+            </w:pPr>
+            <w:r>
+              <w:t xml:space="preserve">decision_evidence</w:t>
+            </w:r>
+          </w:p>
+        </w:tc>
+        <w:tc>
+          <w:tcPr/>
+          <w:p>
+            <w:pPr>
+              <w:pStyle w:val="Compact"/>
+              <w:jc w:val="right"/>
+            </w:pPr>
+            <w:r>
+              <w:t xml:space="preserve">Excluded</w:t>
+            </w:r>
+          </w:p>
+        </w:tc>
+        <w:tc>
+          <w:tcPr/>
+          <w:p>
+            <w:pPr>
+              <w:pStyle w:val="Compact"/>
+              <w:jc w:val="right"/>
+            </w:pPr>
+            <w:r>
+              <w:t xml:space="preserve">% of exclusions</w:t>
+            </w:r>
+          </w:p>
+        </w:tc>
+      </w:tr>
+      <w:tr>
+        <w:tc>
+          <w:tcPr/>
+          <w:p>
+            <w:pPr>
+              <w:pStyle w:val="Compact"/>
+              <w:jc w:val="left"/>
+            </w:pPr>
+            <w:r>
+              <w:t xml:space="preserve">MD + IRV high</w:t>
+            </w:r>
+          </w:p>
+        </w:tc>
+        <w:tc>
+          <w:tcPr/>
+          <w:p>
+            <w:pPr>
+              <w:pStyle w:val="Compact"/>
+              <w:jc w:val="right"/>
+            </w:pPr>
+            <w:r>
+              <w:t xml:space="preserve">41</w:t>
+            </w:r>
+          </w:p>
+        </w:tc>
+        <w:tc>
+          <w:tcPr/>
+          <w:p>
+            <w:pPr>
+              <w:pStyle w:val="Compact"/>
+              <w:jc w:val="right"/>
+            </w:pPr>
+            <w:r>
+              <w:t xml:space="preserve">66.1</w:t>
+            </w:r>
+          </w:p>
+        </w:tc>
+      </w:tr>
+      <w:tr>
+        <w:tc>
+          <w:tcPr/>
+          <w:p>
+            <w:pPr>
+              <w:pStyle w:val="Compact"/>
+              <w:jc w:val="left"/>
+            </w:pPr>
+            <w:r>
+              <w:t xml:space="preserve">Laz.R + IRV low</w:t>
+            </w:r>
+          </w:p>
+        </w:tc>
+        <w:tc>
+          <w:tcPr/>
+          <w:p>
+            <w:pPr>
+              <w:pStyle w:val="Compact"/>
+              <w:jc w:val="right"/>
+            </w:pPr>
+            <w:r>
+              <w:t xml:space="preserve">18</w:t>
+            </w:r>
+          </w:p>
+        </w:tc>
+        <w:tc>
+          <w:tcPr/>
+          <w:p>
+            <w:pPr>
+              <w:pStyle w:val="Compact"/>
+              <w:jc w:val="right"/>
+            </w:pPr>
+            <w:r>
+              <w:t xml:space="preserve">29.0</w:t>
+            </w:r>
+          </w:p>
+        </w:tc>
+      </w:tr>
+      <w:tr>
+        <w:tc>
+          <w:tcPr/>
+          <w:p>
+            <w:pPr>
+              <w:pStyle w:val="Compact"/>
+              <w:jc w:val="left"/>
+            </w:pPr>
+            <w:r>
+              <w:t xml:space="preserve">Laz.R + IRV high</w:t>
+            </w:r>
+          </w:p>
+        </w:tc>
+        <w:tc>
+          <w:tcPr/>
+          <w:p>
+            <w:pPr>
+              <w:pStyle w:val="Compact"/>
+              <w:jc w:val="right"/>
+            </w:pPr>
+            <w:r>
+              <w:t xml:space="preserve">1</w:t>
+            </w:r>
+          </w:p>
+        </w:tc>
+        <w:tc>
+          <w:tcPr/>
+          <w:p>
+            <w:pPr>
+              <w:pStyle w:val="Compact"/>
+              <w:jc w:val="right"/>
+            </w:pPr>
+            <w:r>
+              <w:t xml:space="preserve">1.6</w:t>
+            </w:r>
+          </w:p>
+        </w:tc>
+      </w:tr>
+      <w:tr>
+        <w:tc>
+          <w:tcPr/>
+          <w:p>
+            <w:pPr>
+              <w:pStyle w:val="Compact"/>
+              <w:jc w:val="left"/>
+            </w:pPr>
+            <w:r>
+              <w:t xml:space="preserve">Laz.R + MD</w:t>
+            </w:r>
+          </w:p>
+        </w:tc>
+        <w:tc>
+          <w:tcPr/>
+          <w:p>
+            <w:pPr>
+              <w:pStyle w:val="Compact"/>
+              <w:jc w:val="right"/>
+            </w:pPr>
+            <w:r>
+              <w:t xml:space="preserve">1</w:t>
+            </w:r>
+          </w:p>
+        </w:tc>
+        <w:tc>
+          <w:tcPr/>
+          <w:p>
+            <w:pPr>
+              <w:pStyle w:val="Compact"/>
+              <w:jc w:val="right"/>
+            </w:pPr>
+            <w:r>
+              <w:t xml:space="preserve">1.6</w:t>
+            </w:r>
+          </w:p>
+        </w:tc>
+      </w:tr>
+      <w:tr>
+        <w:tc>
+          <w:tcPr/>
+          <w:p>
+            <w:pPr>
+              <w:pStyle w:val="Compact"/>
+              <w:jc w:val="left"/>
+            </w:pPr>
+            <w:r>
+              <w:t xml:space="preserve">Laz.R + MD + IRV high</w:t>
+            </w:r>
+          </w:p>
+        </w:tc>
+        <w:tc>
+          <w:tcPr/>
+          <w:p>
+            <w:pPr>
+              <w:pStyle w:val="Compact"/>
+              <w:jc w:val="right"/>
+            </w:pPr>
+            <w:r>
+              <w:t xml:space="preserve">1</w:t>
+            </w:r>
+          </w:p>
+        </w:tc>
+        <w:tc>
+          <w:tcPr/>
+          <w:p>
+            <w:pPr>
+              <w:pStyle w:val="Compact"/>
+              <w:jc w:val="right"/>
+            </w:pPr>
+            <w:r>
+              <w:t xml:space="preserve">1.6</w:t>
+            </w:r>
+          </w:p>
+        </w:tc>
+      </w:tr>
+    </w:tbl>
+    <w:bookmarkEnd w:id="55"/>
+    <w:p>
+      <w:pPr>
+        <w:pStyle w:val="BodyText"/>
+      </w:pPr>
+      <w:r>
+        <w:rPr>
+          <w:vertAlign w:val="subscript"/>
+        </w:rPr>
+        <w:t xml:space="preserve">Source:</w:t>
+      </w:r>
+      <w:r>
+        <w:rPr>
+          <w:vertAlign w:val="subscript"/>
+        </w:rPr>
+        <w:t xml:space="preserve"> </w:t>
+      </w:r>
+      <w:hyperlink r:id="rId56">
+        <w:r>
+          <w:rPr>
+            <w:rStyle w:val="Hyperlink"/>
+            <w:vertAlign w:val="subscript"/>
+          </w:rPr>
+          <w:t xml:space="preserve">Post-hoc C/IER Indicators</w:t>
+        </w:r>
+      </w:hyperlink>
+    </w:p>
+    <w:p>
+      <w:pPr>
+        <w:pStyle w:val="BodyText"/>
+      </w:pPr>
+    </w:p>
+    <w:p>
+      <w:pPr>
+        <w:pStyle w:val="BodyText"/>
+      </w:pPr>
+      <w:r>
+        <w:t xml:space="preserve">Plan A removes 62 of the 1,295 eligible respondents (4.8%). The full audit log</w:t>
+      </w:r>
+      <w:r>
+        <w:t xml:space="preserve"> </w:t>
+      </w:r>
+      <w:r>
+        <w:t xml:space="preserve">preserves each excluded ID, indicator value, flag, composite count, and evidence</w:t>
+      </w:r>
+      <w:r>
+        <w:t xml:space="preserve"> </w:t>
+      </w:r>
+      <w:r>
+        <w:t xml:space="preserve">combination in</w:t>
+      </w:r>
+      <w:r>
+        <w:t xml:space="preserve"> </w:t>
+      </w:r>
+      <w:r>
+        <w:rPr>
+          <w:rStyle w:val="VerbatimChar"/>
+        </w:rPr>
+        <w:t xml:space="preserve">posthoc-exclusion-log.csv</w:t>
+      </w:r>
+      <w:r>
+        <w:t xml:space="preserve">.</w:t>
+      </w:r>
+    </w:p>
+    <w:bookmarkEnd w:id="57"/>
+    <w:bookmarkStart w:id="73" w:name="final-analysis-dataset"/>
+    <w:p>
+      <w:pPr>
+        <w:pStyle w:val="Heading4"/>
+      </w:pPr>
+      <w:r>
+        <w:t xml:space="preserve">4.5.4 Final analysis dataset</w:t>
+      </w:r>
+    </w:p>
+    <w:bookmarkStart w:id="58" w:name="flags-export"/>
+    <w:p>
+      <w:pPr>
+        <w:pStyle w:val="TableCaption"/>
+      </w:pPr>
+      <w:r>
+        <w:t xml:space="preserve">Derivation of the final analysis sample</w:t>
+      </w:r>
+    </w:p>
+    <w:tbl>
+      <w:tblPr>
+        <w:tblStyle w:val="Table"/>
+        <w:tblW w:type="auto" w:w="0"/>
+        <w:tblLook w:firstRow="1" w:lastRow="0" w:firstColumn="0" w:lastColumn="0" w:noHBand="0" w:noVBand="0" w:val="0020"/>
+        <w:tblCaption w:val="Derivation of the final analysis sample"/>
+      </w:tblPr>
+      <w:tblGrid>
+        <w:gridCol w:w="3960"/>
+        <w:gridCol w:w="3960"/>
+      </w:tblGrid>
+      <w:tr>
+        <w:trPr>
+          <w:tblHeader w:val="on"/>
+        </w:trPr>
+        <w:tc>
+          <w:tcPr/>
+          <w:p>
+            <w:pPr>
+              <w:pStyle w:val="Compact"/>
+              <w:jc w:val="left"/>
+            </w:pPr>
+            <w:r>
+              <w:t xml:space="preserve">Stage</w:t>
+            </w:r>
+          </w:p>
+        </w:tc>
+        <w:tc>
+          <w:tcPr/>
+          <w:p>
+            <w:pPr>
+              <w:pStyle w:val="Compact"/>
+              <w:jc w:val="right"/>
+            </w:pPr>
+            <w:r>
+              <w:t xml:space="preserve">N</w:t>
+            </w:r>
+          </w:p>
+        </w:tc>
+      </w:tr>
+      <w:tr>
+        <w:tc>
+          <w:tcPr/>
+          <w:p>
+            <w:pPr>
+              <w:pStyle w:val="Compact"/>
+              <w:jc w:val="left"/>
+            </w:pPr>
+            <w:r>
+              <w:t xml:space="preserve">Eligible after procedural exclusions</w:t>
+            </w:r>
+          </w:p>
+        </w:tc>
+        <w:tc>
+          <w:tcPr/>
+          <w:p>
+            <w:pPr>
+              <w:pStyle w:val="Compact"/>
+              <w:jc w:val="right"/>
+            </w:pPr>
+            <w:r>
+              <w:t xml:space="preserve">1295</w:t>
+            </w:r>
+          </w:p>
+        </w:tc>
+      </w:tr>
+      <w:tr>
+        <w:tc>
+          <w:tcPr/>
+          <w:p>
+            <w:pPr>
+              <w:pStyle w:val="Compact"/>
+              <w:jc w:val="left"/>
+            </w:pPr>
+            <w:r>
+              <w:t xml:space="preserve">Excluded by Plan A post-hoc rule</w:t>
+            </w:r>
+          </w:p>
+        </w:tc>
+        <w:tc>
+          <w:tcPr/>
+          <w:p>
+            <w:pPr>
+              <w:pStyle w:val="Compact"/>
+              <w:jc w:val="right"/>
+            </w:pPr>
+            <w:r>
+              <w:t xml:space="preserve">62</w:t>
+            </w:r>
+          </w:p>
+        </w:tc>
+      </w:tr>
+      <w:tr>
+        <w:tc>
+          <w:tcPr/>
+          <w:p>
+            <w:pPr>
+              <w:pStyle w:val="Compact"/>
+              <w:jc w:val="left"/>
+            </w:pPr>
+            <w:r>
+              <w:t xml:space="preserve">Final analysis dataset</w:t>
+            </w:r>
+          </w:p>
+        </w:tc>
+        <w:tc>
+          <w:tcPr/>
+          <w:p>
+            <w:pPr>
+              <w:pStyle w:val="Compact"/>
+              <w:jc w:val="right"/>
+            </w:pPr>
+            <w:r>
+              <w:t xml:space="preserve">1233</w:t>
+            </w:r>
+          </w:p>
+        </w:tc>
+      </w:tr>
+    </w:tbl>
+    <w:bookmarkEnd w:id="58"/>
+    <w:p>
+      <w:pPr>
+        <w:pStyle w:val="BodyText"/>
+      </w:pPr>
+      <w:r>
+        <w:rPr>
+          <w:vertAlign w:val="subscript"/>
+        </w:rPr>
+        <w:t xml:space="preserve">Source:</w:t>
+      </w:r>
+      <w:r>
+        <w:rPr>
+          <w:vertAlign w:val="subscript"/>
+        </w:rPr>
+        <w:t xml:space="preserve"> </w:t>
+      </w:r>
+      <w:hyperlink r:id="rId59">
+        <w:r>
+          <w:rPr>
+            <w:rStyle w:val="Hyperlink"/>
+            <w:vertAlign w:val="subscript"/>
+          </w:rPr>
+          <w:t xml:space="preserve">Post-hoc C/IER Indicators</w:t>
+        </w:r>
+      </w:hyperlink>
+    </w:p>
+    <w:p>
+      <w:pPr>
+        <w:pStyle w:val="BodyText"/>
+      </w:pPr>
+    </w:p>
+    <w:p>
+      <w:pPr>
+        <w:pStyle w:val="BodyText"/>
+      </w:pPr>
+      <w:r>
+        <w:t xml:space="preserve">The final</w:t>
+      </w:r>
+      <w:r>
+        <w:t xml:space="preserve"> </w:t>
+      </w:r>
+      <w:r>
+        <w:rPr>
+          <w:rStyle w:val="VerbatimChar"/>
+        </w:rPr>
+        <w:t xml:space="preserve">whoqol_analysis.csv</w:t>
+      </w:r>
+      <w:r>
+        <w:t xml:space="preserve"> </w:t>
+      </w:r>
+      <w:r>
+        <w:t xml:space="preserve">contains 1,233 respondents, the</w:t>
+      </w:r>
+      <w:r>
+        <w:t xml:space="preserve"> </w:t>
+      </w:r>
+      <w:r>
+        <w:rPr>
+          <w:rStyle w:val="VerbatimChar"/>
+        </w:rPr>
+        <w:t xml:space="preserve">ID</w:t>
+      </w:r>
+      <w:r>
+        <w:t xml:space="preserve"> </w:t>
+      </w:r>
+      <w:r>
+        <w:t xml:space="preserve">column,</w:t>
+      </w:r>
+      <w:r>
+        <w:t xml:space="preserve"> </w:t>
+      </w:r>
+      <w:r>
+        <w:t xml:space="preserve">and</w:t>
+      </w:r>
+      <w:r>
+        <w:t xml:space="preserve"> </w:t>
+      </w:r>
+      <w:r>
+        <w:rPr>
+          <w:rStyle w:val="VerbatimChar"/>
+        </w:rPr>
+        <w:t xml:space="preserve">Q1-Q26</w:t>
+      </w:r>
+      <w:r>
+        <w:t xml:space="preserve">. Items Q3, Q4, and Q26 are reverse-scored only after the C/IER</w:t>
+      </w:r>
+      <w:r>
+        <w:t xml:space="preserve"> </w:t>
+      </w:r>
+      <w:r>
+        <w:t xml:space="preserve">indicators have been calculated on the response sequence as administered. For</w:t>
+      </w:r>
+      <w:r>
+        <w:t xml:space="preserve"> </w:t>
+      </w:r>
+      <w:r>
+        <w:t xml:space="preserve">substantive analyses, the unfiltered 1,295-case dataset can be retained as a</w:t>
+      </w:r>
+      <w:r>
+        <w:t xml:space="preserve"> </w:t>
+      </w:r>
+      <w:r>
+        <w:t xml:space="preserve">sensitivity condition. Large changes between filtered and unfiltered results</w:t>
+      </w:r>
+      <w:r>
+        <w:t xml:space="preserve"> </w:t>
+      </w:r>
+      <w:r>
+        <w:t xml:space="preserve">should be reported rather than used to choose whichever cleaning rule produces</w:t>
+      </w:r>
+      <w:r>
+        <w:t xml:space="preserve"> </w:t>
+      </w:r>
+      <w:r>
+        <w:t xml:space="preserve">the preferred result</w:t>
+      </w:r>
+      <w:r>
+        <w:t xml:space="preserve"> </w:t>
+      </w:r>
+      <w:r>
+        <w:t xml:space="preserve">(Wang et al., 2025)</w:t>
+      </w:r>
+      <w:r>
+        <w:t xml:space="preserve">.</w:t>
+      </w:r>
+    </w:p>
+    <w:bookmarkStart w:id="72" w:name="refs"/>
+    <w:bookmarkStart w:id="61" w:name="ref-biemann2025"/>
     <w:p>
       <w:pPr>
         <w:pStyle w:val="Bibliography"/>
@@ -2335,7 +4775,7 @@
       <w:r>
         <w:t xml:space="preserve"> </w:t>
       </w:r>
-      <w:hyperlink r:id="rId46">
+      <w:hyperlink r:id="rId60">
         <w:r>
           <w:rPr>
             <w:rStyle w:val="Hyperlink"/>
@@ -2344,8 +4784,8 @@
         </w:r>
       </w:hyperlink>
     </w:p>
-    <w:bookmarkEnd w:id="47"/>
-    <w:bookmarkStart w:id="49" w:name="ref-curran2016"/>
+    <w:bookmarkEnd w:id="61"/>
+    <w:bookmarkStart w:id="63" w:name="ref-curran2016"/>
     <w:p>
       <w:pPr>
         <w:pStyle w:val="Bibliography"/>
@@ -2382,7 +4822,7 @@
       <w:r>
         <w:t xml:space="preserve"> </w:t>
       </w:r>
-      <w:hyperlink r:id="rId48">
+      <w:hyperlink r:id="rId62">
         <w:r>
           <w:rPr>
             <w:rStyle w:val="Hyperlink"/>
@@ -2391,8 +4831,8 @@
         </w:r>
       </w:hyperlink>
     </w:p>
-    <w:bookmarkEnd w:id="49"/>
-    <w:bookmarkStart w:id="51" w:name="ref-hong2020"/>
+    <w:bookmarkEnd w:id="63"/>
+    <w:bookmarkStart w:id="65" w:name="ref-hong2020"/>
     <w:p>
       <w:pPr>
         <w:pStyle w:val="Bibliography"/>
@@ -2459,7 +4899,7 @@
       <w:r>
         <w:t xml:space="preserve"> </w:t>
       </w:r>
-      <w:hyperlink r:id="rId50">
+      <w:hyperlink r:id="rId64">
         <w:r>
           <w:rPr>
             <w:rStyle w:val="Hyperlink"/>
@@ -2468,8 +4908,8 @@
         </w:r>
       </w:hyperlink>
     </w:p>
-    <w:bookmarkEnd w:id="51"/>
-    <w:bookmarkStart w:id="53" w:name="ref-huang2026"/>
+    <w:bookmarkEnd w:id="65"/>
+    <w:bookmarkStart w:id="67" w:name="ref-huang2026"/>
     <w:p>
       <w:pPr>
         <w:pStyle w:val="Bibliography"/>
@@ -2597,7 +5037,7 @@
       <w:r>
         <w:t xml:space="preserve"> </w:t>
       </w:r>
-      <w:hyperlink r:id="rId52">
+      <w:hyperlink r:id="rId66">
         <w:r>
           <w:rPr>
             <w:rStyle w:val="Hyperlink"/>
@@ -2606,10 +5046,195 @@
         </w:r>
       </w:hyperlink>
     </w:p>
-    <w:bookmarkEnd w:id="53"/>
-    <w:bookmarkEnd w:id="54"/>
-    <w:bookmarkEnd w:id="55"/>
-    <w:bookmarkEnd w:id="56"/>
+    <w:bookmarkEnd w:id="67"/>
+    <w:bookmarkStart w:id="69" w:name="ref-wang2025b"/>
+    <w:p>
+      <w:pPr>
+        <w:pStyle w:val="Bibliography"/>
+      </w:pPr>
+      <w:r>
+        <w:t xml:space="preserve">Wang, M. D., Xiao, L., &amp; Zang, X. (2025). When</w:t>
+      </w:r>
+      <w:r>
+        <w:t xml:space="preserve"> </w:t>
+      </w:r>
+      <w:r>
+        <w:t xml:space="preserve">Cleaning Data Introduces Bias</w:t>
+      </w:r>
+      <w:r>
+        <w:t xml:space="preserve">:</w:t>
+      </w:r>
+      <w:r>
+        <w:t xml:space="preserve"> </w:t>
+      </w:r>
+      <w:r>
+        <w:t xml:space="preserve">A Critical Examination</w:t>
+      </w:r>
+      <w:r>
+        <w:t xml:space="preserve"> </w:t>
+      </w:r>
+      <w:r>
+        <w:t xml:space="preserve">of</w:t>
+      </w:r>
+      <w:r>
+        <w:t xml:space="preserve"> </w:t>
+      </w:r>
+      <w:r>
+        <w:t xml:space="preserve">Post-Hoc Methods</w:t>
+      </w:r>
+      <w:r>
+        <w:t xml:space="preserve"> </w:t>
+      </w:r>
+      <w:r>
+        <w:t xml:space="preserve">in</w:t>
+      </w:r>
+      <w:r>
+        <w:t xml:space="preserve"> </w:t>
+      </w:r>
+      <w:r>
+        <w:t xml:space="preserve">Detecting Insufficient Effort Responding</w:t>
+      </w:r>
+      <w:r>
+        <w:t xml:space="preserve">.</w:t>
+      </w:r>
+      <w:r>
+        <w:t xml:space="preserve"> </w:t>
+      </w:r>
+      <w:r>
+        <w:rPr>
+          <w:i/>
+          <w:iCs/>
+        </w:rPr>
+        <w:t xml:space="preserve">Journal of Official Statistics</w:t>
+      </w:r>
+      <w:r>
+        <w:t xml:space="preserve">,</w:t>
+      </w:r>
+      <w:r>
+        <w:t xml:space="preserve"> </w:t>
+      </w:r>
+      <w:r>
+        <w:rPr>
+          <w:i/>
+          <w:iCs/>
+        </w:rPr>
+        <w:t xml:space="preserve">41</w:t>
+      </w:r>
+      <w:r>
+        <w:t xml:space="preserve">(4).</w:t>
+      </w:r>
+      <w:r>
+        <w:t xml:space="preserve"> </w:t>
+      </w:r>
+      <w:hyperlink r:id="rId68">
+        <w:r>
+          <w:rPr>
+            <w:rStyle w:val="Hyperlink"/>
+          </w:rPr>
+          <w:t xml:space="preserve">https://doi.org/10.1177/0282423X251337843</w:t>
+        </w:r>
+      </w:hyperlink>
+    </w:p>
+    <w:bookmarkEnd w:id="69"/>
+    <w:bookmarkStart w:id="71" w:name="ref-ward2023"/>
+    <w:p>
+      <w:pPr>
+        <w:pStyle w:val="Bibliography"/>
+      </w:pPr>
+      <w:r>
+        <w:t xml:space="preserve">Ward, M. K., &amp; Meade, A. W. (2023). Dealing with</w:t>
+      </w:r>
+      <w:r>
+        <w:t xml:space="preserve"> </w:t>
+      </w:r>
+      <w:r>
+        <w:t xml:space="preserve">Careless Responding</w:t>
+      </w:r>
+      <w:r>
+        <w:t xml:space="preserve"> </w:t>
+      </w:r>
+      <w:r>
+        <w:t xml:space="preserve">in</w:t>
+      </w:r>
+      <w:r>
+        <w:t xml:space="preserve"> </w:t>
+      </w:r>
+      <w:r>
+        <w:t xml:space="preserve">Survey Data</w:t>
+      </w:r>
+      <w:r>
+        <w:t xml:space="preserve">:</w:t>
+      </w:r>
+      <w:r>
+        <w:t xml:space="preserve"> </w:t>
+      </w:r>
+      <w:r>
+        <w:t xml:space="preserve">Prevention</w:t>
+      </w:r>
+      <w:r>
+        <w:t xml:space="preserve">,</w:t>
+      </w:r>
+      <w:r>
+        <w:t xml:space="preserve"> </w:t>
+      </w:r>
+      <w:r>
+        <w:t xml:space="preserve">Identification</w:t>
+      </w:r>
+      <w:r>
+        <w:t xml:space="preserve">, and</w:t>
+      </w:r>
+      <w:r>
+        <w:t xml:space="preserve"> </w:t>
+      </w:r>
+      <w:r>
+        <w:t xml:space="preserve">Recommended Best Practices</w:t>
+      </w:r>
+      <w:r>
+        <w:t xml:space="preserve">.</w:t>
+      </w:r>
+      <w:r>
+        <w:t xml:space="preserve"> </w:t>
+      </w:r>
+      <w:r>
+        <w:rPr>
+          <w:i/>
+          <w:iCs/>
+        </w:rPr>
+        <w:t xml:space="preserve">Annu. Rev. Psychol.</w:t>
+      </w:r>
+      <w:r>
+        <w:t xml:space="preserve">,</w:t>
+      </w:r>
+      <w:r>
+        <w:t xml:space="preserve"> </w:t>
+      </w:r>
+      <w:r>
+        <w:rPr>
+          <w:i/>
+          <w:iCs/>
+        </w:rPr>
+        <w:t xml:space="preserve">74</w:t>
+      </w:r>
+      <w:r>
+        <w:t xml:space="preserve">(Volume 74, 2023), 577–596.</w:t>
+      </w:r>
+      <w:r>
+        <w:t xml:space="preserve"> </w:t>
+      </w:r>
+      <w:hyperlink r:id="rId70">
+        <w:r>
+          <w:rPr>
+            <w:rStyle w:val="Hyperlink"/>
+          </w:rPr>
+          <w:t xml:space="preserve">https://doi.org/10.1146/annurev-psych-040422-045007</w:t>
+        </w:r>
+      </w:hyperlink>
+    </w:p>
+    <w:bookmarkEnd w:id="71"/>
+    <w:bookmarkEnd w:id="72"/>
+    <w:bookmarkEnd w:id="73"/>
+    <w:bookmarkEnd w:id="74"/>
+    <w:bookmarkEnd w:id="75"/>
     <w:sectPr>
       <w:footnotePr>
         <w:numRestart w:val="eachSect"/>

</xml_diff>